<commit_message>
feat: complete postgis sqli playground with 487-lot dataset, documentation, and replication guide
</commit_message>
<xml_diff>
--- a/Articulo_Cientifico_IMJETA_FINAL_EN.docx
+++ b/Articulo_Cientifico_IMJETA_FINAL_EN.docx
@@ -14,213 +14,67 @@
           <w:sz w:val="22"/>
         </w:rPr>
       </w:pPr>
-      <w:r>
+      <w:r/>
+      <w:r>
+        <w:rPr>
+          <w:rFonts w:ascii="Book Antiqua" w:hAnsi="Book Antiqua"/>
+          <w:b w:val="0"/>
+          <w:i w:val="0"/>
+          <w:sz w:val="22"/>
+        </w:rPr>
+        <w:t>International   Multidisciplinary   Journal   of    Technologies   and   Applications (IMJETA)</w:t>
+      </w:r>
+    </w:p>
+    <w:p>
+      <w:pPr>
+        <w:spacing w:after="0" w:line="240" w:lineRule="auto"/>
         <w:rPr>
           <w:rFonts w:ascii="Book Antiqua" w:eastAsia="Book Antiqua" w:hAnsi="Book Antiqua" w:cs="Book Antiqua"/>
           <w:i/>
-          <w:color w:val="000000"/>
-          <w:sz w:val="22"/>
-        </w:rPr>
-        <w:t>International</w:t>
-      </w:r>
-      <w:r>
+        </w:rPr>
+      </w:pPr>
+      <w:r/>
+      <w:r>
+        <w:rPr>
+          <w:rFonts w:ascii="Book Antiqua" w:hAnsi="Book Antiqua"/>
+          <w:b w:val="0"/>
+          <w:i w:val="0"/>
+        </w:rPr>
+        <w:t>Vol. 1, No. 1, pp. a-b, Month 2026</w:t>
+      </w:r>
+    </w:p>
+    <w:p>
+      <w:pPr>
+        <w:spacing w:after="0" w:line="240" w:lineRule="auto"/>
         <w:rPr>
           <w:rFonts w:ascii="Book Antiqua" w:eastAsia="Book Antiqua" w:hAnsi="Book Antiqua" w:cs="Book Antiqua"/>
           <w:i/>
-          <w:color w:val="000000"/>
-          <w:sz w:val="22"/>
-        </w:rPr>
-        <w:t xml:space="preserve"> </w:t>
-      </w:r>
-      <w:r>
+        </w:rPr>
+      </w:pPr>
+      <w:r/>
+      <w:r>
+        <w:rPr>
+          <w:rFonts w:ascii="Book Antiqua" w:hAnsi="Book Antiqua"/>
+          <w:b w:val="0"/>
+          <w:i w:val="0"/>
+        </w:rPr>
+        <w:t>Received Month 00, 2026; Revised Month 00, 2026; Accepted Month 00, 2026</w:t>
+      </w:r>
+    </w:p>
+    <w:p>
+      <w:pPr>
+        <w:spacing w:after="0" w:line="240" w:lineRule="auto"/>
         <w:rPr>
           <w:rFonts w:ascii="Book Antiqua" w:eastAsia="Book Antiqua" w:hAnsi="Book Antiqua" w:cs="Book Antiqua"/>
           <w:i/>
-          <w:color w:val="000000"/>
-          <w:sz w:val="22"/>
-        </w:rPr>
-        <w:t xml:space="preserve"> </w:t>
-      </w:r>
-      <w:r>
-        <w:rPr>
-          <w:rFonts w:ascii="Book Antiqua" w:eastAsia="Book Antiqua" w:hAnsi="Book Antiqua" w:cs="Book Antiqua"/>
-          <w:i/>
-          <w:color w:val="000000"/>
-          <w:sz w:val="22"/>
-        </w:rPr>
-        <w:t xml:space="preserve"> </w:t>
-      </w:r>
-      <w:r>
-        <w:rPr>
-          <w:rFonts w:ascii="Book Antiqua" w:eastAsia="Book Antiqua" w:hAnsi="Book Antiqua" w:cs="Book Antiqua"/>
-          <w:i/>
-          <w:color w:val="000000"/>
-          <w:sz w:val="22"/>
-        </w:rPr>
-        <w:t>Multidisciplinary</w:t>
-      </w:r>
-      <w:r>
-        <w:rPr>
-          <w:rFonts w:ascii="Book Antiqua" w:eastAsia="Book Antiqua" w:hAnsi="Book Antiqua" w:cs="Book Antiqua"/>
-          <w:i/>
-          <w:color w:val="000000"/>
-          <w:sz w:val="22"/>
-        </w:rPr>
-        <w:t xml:space="preserve"> </w:t>
-      </w:r>
-      <w:r>
-        <w:rPr>
-          <w:rFonts w:ascii="Book Antiqua" w:eastAsia="Book Antiqua" w:hAnsi="Book Antiqua" w:cs="Book Antiqua"/>
-          <w:i/>
-          <w:color w:val="000000"/>
-          <w:sz w:val="22"/>
-        </w:rPr>
-        <w:t xml:space="preserve"> </w:t>
-      </w:r>
-      <w:r>
-        <w:rPr>
-          <w:rFonts w:ascii="Book Antiqua" w:eastAsia="Book Antiqua" w:hAnsi="Book Antiqua" w:cs="Book Antiqua"/>
-          <w:i/>
-          <w:color w:val="000000"/>
-          <w:sz w:val="22"/>
-        </w:rPr>
-        <w:t xml:space="preserve"> </w:t>
-      </w:r>
-      <w:r>
-        <w:rPr>
-          <w:rFonts w:ascii="Book Antiqua" w:eastAsia="Book Antiqua" w:hAnsi="Book Antiqua" w:cs="Book Antiqua"/>
-          <w:i/>
-          <w:color w:val="000000"/>
-          <w:sz w:val="22"/>
-        </w:rPr>
-        <w:t>Journal</w:t>
-      </w:r>
-      <w:r>
-        <w:rPr>
-          <w:rFonts w:ascii="Book Antiqua" w:eastAsia="Book Antiqua" w:hAnsi="Book Antiqua" w:cs="Book Antiqua"/>
-          <w:i/>
-          <w:color w:val="000000"/>
-          <w:sz w:val="22"/>
-        </w:rPr>
-        <w:t xml:space="preserve">  </w:t>
-      </w:r>
-      <w:r>
-        <w:rPr>
-          <w:rFonts w:ascii="Book Antiqua" w:eastAsia="Book Antiqua" w:hAnsi="Book Antiqua" w:cs="Book Antiqua"/>
-          <w:i/>
-          <w:color w:val="000000"/>
-          <w:sz w:val="22"/>
-        </w:rPr>
-        <w:t xml:space="preserve"> of </w:t>
-      </w:r>
-      <w:r>
-        <w:rPr>
-          <w:rFonts w:ascii="Book Antiqua" w:eastAsia="Book Antiqua" w:hAnsi="Book Antiqua" w:cs="Book Antiqua"/>
-          <w:i/>
-          <w:color w:val="000000"/>
-          <w:sz w:val="22"/>
-        </w:rPr>
-        <w:t xml:space="preserve">  </w:t>
-      </w:r>
-      <w:r>
-        <w:rPr>
-          <w:rFonts w:ascii="Book Antiqua" w:eastAsia="Book Antiqua" w:hAnsi="Book Antiqua" w:cs="Book Antiqua"/>
-          <w:i/>
-          <w:color w:val="000000"/>
-          <w:sz w:val="22"/>
-        </w:rPr>
-        <w:t xml:space="preserve"> Technologies</w:t>
-      </w:r>
-      <w:r>
-        <w:rPr>
-          <w:rFonts w:ascii="Book Antiqua" w:eastAsia="Book Antiqua" w:hAnsi="Book Antiqua" w:cs="Book Antiqua"/>
-          <w:i/>
-          <w:color w:val="000000"/>
-          <w:sz w:val="22"/>
-        </w:rPr>
-        <w:t xml:space="preserve">  </w:t>
-      </w:r>
-      <w:r>
-        <w:rPr>
-          <w:rFonts w:ascii="Book Antiqua" w:eastAsia="Book Antiqua" w:hAnsi="Book Antiqua" w:cs="Book Antiqua"/>
-          <w:i/>
-          <w:color w:val="000000"/>
-          <w:sz w:val="22"/>
-        </w:rPr>
-        <w:t xml:space="preserve"> and </w:t>
-      </w:r>
-      <w:r>
-        <w:rPr>
-          <w:rFonts w:ascii="Book Antiqua" w:eastAsia="Book Antiqua" w:hAnsi="Book Antiqua" w:cs="Book Antiqua"/>
-          <w:i/>
-          <w:color w:val="000000"/>
-          <w:sz w:val="22"/>
-        </w:rPr>
-        <w:t xml:space="preserve">  </w:t>
-      </w:r>
-      <w:r>
-        <w:rPr>
-          <w:rFonts w:ascii="Book Antiqua" w:eastAsia="Book Antiqua" w:hAnsi="Book Antiqua" w:cs="Book Antiqua"/>
-          <w:i/>
-          <w:color w:val="000000"/>
-          <w:sz w:val="22"/>
-        </w:rPr>
-        <w:t>Applications</w:t>
-      </w:r>
-      <w:r>
-        <w:rPr>
-          <w:rFonts w:ascii="Book Antiqua" w:eastAsia="Book Antiqua" w:hAnsi="Book Antiqua" w:cs="Book Antiqua"/>
-          <w:i/>
-          <w:color w:val="000000"/>
-          <w:sz w:val="22"/>
-        </w:rPr>
-        <w:t xml:space="preserve"> (IMJETA)</w:t>
-      </w:r>
-    </w:p>
-    <w:p>
-      <w:pPr>
-        <w:spacing w:after="0" w:line="240" w:lineRule="auto"/>
-        <w:rPr>
-          <w:rFonts w:ascii="Book Antiqua" w:eastAsia="Book Antiqua" w:hAnsi="Book Antiqua" w:cs="Book Antiqua"/>
-          <w:i/>
-        </w:rPr>
-      </w:pPr>
-      <w:r>
-        <w:rPr>
-          <w:rFonts w:ascii="Book Antiqua" w:eastAsia="Book Antiqua" w:hAnsi="Book Antiqua" w:cs="Book Antiqua"/>
-          <w:i/>
-        </w:rPr>
-        <w:t>Vol. 1, No. 1, pp. a-b, Month 2026</w:t>
-      </w:r>
-    </w:p>
-    <w:p>
-      <w:pPr>
-        <w:spacing w:after="0" w:line="240" w:lineRule="auto"/>
-        <w:rPr>
-          <w:rFonts w:ascii="Book Antiqua" w:eastAsia="Book Antiqua" w:hAnsi="Book Antiqua" w:cs="Book Antiqua"/>
-          <w:i/>
-        </w:rPr>
-      </w:pPr>
-      <w:r>
-        <w:rPr>
-          <w:rFonts w:ascii="Book Antiqua" w:eastAsia="Book Antiqua" w:hAnsi="Book Antiqua" w:cs="Book Antiqua"/>
-          <w:i/>
-        </w:rPr>
-        <w:t>Received Month 00, 2026; Revised Month 00, 2026; Accepted Month 00, 2026</w:t>
-      </w:r>
-    </w:p>
-    <w:p>
-      <w:pPr>
-        <w:spacing w:after="0" w:line="240" w:lineRule="auto"/>
-        <w:rPr>
-          <w:rFonts w:ascii="Book Antiqua" w:eastAsia="Book Antiqua" w:hAnsi="Book Antiqua" w:cs="Book Antiqua"/>
-          <w:i/>
-        </w:rPr>
-      </w:pPr>
-      <w:r>
-        <w:rPr>
-          <w:rFonts w:ascii="Book Antiqua" w:eastAsia="Book Antiqua" w:hAnsi="Book Antiqua" w:cs="Book Antiqua"/>
-          <w:i/>
+        </w:rPr>
+      </w:pPr>
+      <w:r/>
+      <w:r>
+        <w:rPr>
+          <w:rFonts w:ascii="Book Antiqua" w:hAnsi="Book Antiqua"/>
+          <w:b w:val="0"/>
+          <w:i w:val="0"/>
         </w:rPr>
         <w:t>Published Month 00 2026</w:t>
       </w:r>
@@ -228,14 +82,13 @@
     <w:p>
       <w:pPr>
         <w:spacing w:before="240" w:after="240"/>
-        <w:jc w:val="left"/>
-      </w:pPr>
+      </w:pPr>
+      <w:r/>
       <w:r>
         <w:rPr>
           <w:rFonts w:ascii="Book Antiqua" w:hAnsi="Book Antiqua"/>
           <w:b/>
           <w:i w:val="0"/>
-          <w:color w:val="000000"/>
           <w:sz w:val="36"/>
         </w:rPr>
         <w:t>Evaluation of Spatial SQL Injection Vulnerabilities in PostGIS-Based Cadastral Information Systems</w:t>
@@ -245,13 +98,12 @@
       <w:pPr>
         <w:spacing w:after="80"/>
       </w:pPr>
+      <w:r/>
       <w:r>
         <w:rPr>
           <w:rFonts w:ascii="Book Antiqua" w:hAnsi="Book Antiqua"/>
           <w:b/>
           <w:i w:val="0"/>
-          <w:color w:val="000000"/>
-          <w:sz w:val="22"/>
         </w:rPr>
         <w:t>Rodrigo Surname1[0000-0002-XXXX-XXXX]</w:t>
       </w:r>
@@ -260,12 +112,12 @@
       <w:pPr>
         <w:spacing w:after="40"/>
       </w:pPr>
+      <w:r/>
       <w:r>
         <w:rPr>
           <w:rFonts w:ascii="Book Antiqua" w:hAnsi="Book Antiqua"/>
           <w:b w:val="0"/>
           <w:i/>
-          <w:color w:val="000000"/>
           <w:sz w:val="20"/>
         </w:rPr>
         <w:t>1National University / Doctoral Program in Cybersecurity</w:t>
@@ -275,12 +127,12 @@
       <w:pPr>
         <w:spacing w:after="240"/>
       </w:pPr>
+      <w:r/>
       <w:r>
         <w:rPr>
           <w:rFonts w:ascii="Book Antiqua" w:hAnsi="Book Antiqua"/>
           <w:b w:val="0"/>
           <w:i w:val="0"/>
-          <w:color w:val="000000"/>
           <w:sz w:val="20"/>
         </w:rPr>
         <w:t>investigador.catastro@doctorado.edu.pe</w:t>
@@ -291,12 +143,12 @@
         <w:spacing w:after="120" w:line="240" w:lineRule="auto"/>
         <w:ind w:left="720" w:right="720"/>
       </w:pPr>
+      <w:r/>
       <w:r>
         <w:rPr>
           <w:rFonts w:ascii="Book Antiqua" w:hAnsi="Book Antiqua"/>
           <w:b/>
           <w:i w:val="0"/>
-          <w:color w:val="000000"/>
           <w:sz w:val="20"/>
         </w:rPr>
         <w:t xml:space="preserve">Abstract. </w:t>
@@ -306,10 +158,9 @@
           <w:rFonts w:ascii="Book Antiqua" w:hAnsi="Book Antiqua"/>
           <w:b w:val="0"/>
           <w:i w:val="0"/>
-          <w:color w:val="000000"/>
           <w:sz w:val="20"/>
         </w:rPr>
-        <w:t>The integration of spatial databases into web architectures has expanded the attack surface for modern applications; however, the specific risks associated with spatial SQL injections remain largely underexplored. This paper investigates the exploitation and mitigation of spatial SQL injections within cadastral information systems utilizing PostGIS. A containerized testbed was developed using Docker to simulate a critical infrastructure API built with Python (FastAPI) and PostgreSQL/PostGIS. The study demonstrates how attackers can leverage spatial functions (e.g., ST_DWithin, ST_Intersects) to manipulate geospatial logic, exfiltrate unauthorized zoning data, or induce denial-of-service states. Furthermore, the research evaluates the performance impact of implementing robust mitigation strategies, comparing vulnerable dynamic spatial queries with parameterized queries executed via Object-Relational Mapping (ORM) tools such as SQLAlchemy and GeoAlchemy2. Results demonstrate that the proposed pipeline neutralized 100% of the attack vectors with a mean latency overhead of 2.63 ms (+15.24%) and a 12.59% improvement in tail stability (p99). We conclude that effective spatial injection mitigation relies on enforcing in-memory topological validation and rigid ORM parameterization at the application layer rather than perimeter firewalls, securing cadastral integrity with minimal operational overhead.</w:t>
+        <w:t>The incorporation of spatial databases into web architectures has expanded the attack surface for modern applications; however, the risks associated with spatial SQL injections remain underexplored. This article investigates the exploitation and mitigation of spatial SQL injections within cadastral information systems that use PostGIS. A containerized testbed environment was developed, using Docker, to simulate an infrastructure API built with Python (FastAPI) and PostgreSQL/PostGIS. The study demonstrates how attackers can leverage spatial functions (ST_DWithin, ST_Intersects) to manipulate geospatial logic, extract unauthorized zoning data, or induce denial of service states. Furthermore, the research evaluates the impact on performance when implementing robust mitigation strategies, comparing vulnerable dynamic spatial queries with parameterized queries executed through Object-Relational Mapping (ORM) tools such as SQLAlchemy and GeoAlchemy2. The results indicate that the proposed pipeline neutralized 100% of the attack vectors with an average latency overhead of 2.63 ms (+15.24%) and a 12.59% improvement in tail stability (p99). It is concluded that effective mitigation of spatial injections relies on transferring topological validation and rigid parameterization to the application layer (ORM), ensuring cadastral integrity with marginal operational impact.</w:t>
       </w:r>
     </w:p>
     <w:p>
@@ -317,12 +168,12 @@
         <w:spacing w:after="280"/>
         <w:ind w:left="720" w:right="720"/>
       </w:pPr>
+      <w:r/>
       <w:r>
         <w:rPr>
           <w:rFonts w:ascii="Book Antiqua" w:hAnsi="Book Antiqua"/>
           <w:b/>
           <w:i w:val="0"/>
-          <w:color w:val="000000"/>
           <w:sz w:val="20"/>
         </w:rPr>
         <w:t xml:space="preserve">Keywords: </w:t>
@@ -332,7 +183,6 @@
           <w:rFonts w:ascii="Book Antiqua" w:hAnsi="Book Antiqua"/>
           <w:b w:val="0"/>
           <w:i w:val="0"/>
-          <w:color w:val="000000"/>
           <w:sz w:val="20"/>
         </w:rPr>
         <w:t>Spatial injections; Cadastral systems; Geospatial cybersecurity; Penetration testing; Databases</w:t>
@@ -343,12 +193,12 @@
         <w:keepNext/>
         <w:spacing w:before="240" w:after="80"/>
       </w:pPr>
+      <w:r/>
       <w:r>
         <w:rPr>
           <w:rFonts w:ascii="Book Antiqua" w:hAnsi="Book Antiqua"/>
           <w:b/>
           <w:i w:val="0"/>
-          <w:color w:val="000000"/>
           <w:sz w:val="24"/>
         </w:rPr>
         <w:t>1. Introduction</w:t>
@@ -358,15 +208,14 @@
       <w:pPr>
         <w:spacing w:after="80" w:line="240" w:lineRule="auto"/>
       </w:pPr>
+      <w:r/>
       <w:r>
         <w:rPr>
           <w:rFonts w:ascii="Book Antiqua" w:hAnsi="Book Antiqua"/>
           <w:b w:val="0"/>
           <w:i w:val="0"/>
-          <w:color w:val="000000"/>
-          <w:sz w:val="22"/>
-        </w:rPr>
-        <w:t>Modern cadastral information systems expose web services and spatial geoportals over client-server architectures to administer land tenure, municipal zoning, and property taxation (Lemmen et al., 2015). Within this operational domain, PostgreSQL along with its PostGIS spatial extension represents the predominant open-source solution for storing and querying official vector cartography (Obe &amp; Hsu, 2021).</w:t>
+        </w:rPr>
+        <w:t>Modern cadastral information systems expose web services and geoportals over client-server architectures to administer land tenure, urban zoning, and tax collection (Lemmen et al., 2015). In this field, PostgreSQL along with its PostGIS spatial extension constitutes the most widely used open-source solution for the persistence and querying of official vector cartography (Obe &amp; Hsu, 2021).</w:t>
       </w:r>
     </w:p>
     <w:p>
@@ -374,15 +223,14 @@
         <w:spacing w:after="80" w:line="240" w:lineRule="auto"/>
         <w:ind w:firstLine="432"/>
       </w:pPr>
+      <w:r/>
       <w:r>
         <w:rPr>
           <w:rFonts w:ascii="Book Antiqua" w:hAnsi="Book Antiqua"/>
           <w:b w:val="0"/>
           <w:i w:val="0"/>
-          <w:color w:val="000000"/>
-          <w:sz w:val="22"/>
-        </w:rPr>
-        <w:t>However, exposing these spatial data services via REST APIs introduces attack vectors whenever queries are constructed through string concatenation within spatial functions. While classical SQL injection and its risks in web applications have been extensively documented (Clarke, 2012; Halfond et al., 2006; OWASP Foundation, 2021), manipulating PostGIS geometric operators—such as ST_DWithin, ST_Intersects, or ST_Buffer—exhibits distinct mechanics: unsanitized input not only circumvents relational filters or exfiltrates records, but also triggers denial-of-service conditions through topological calculations of high algorithmic complexity.</w:t>
+        </w:rPr>
+        <w:t>However, exposing these services through REST APIs introduces attack vectors when queries are constructed via string concatenation within spatial functions. While classical SQL injection has been widely documented (Clarke, 2012; Halfond et al., 2006; OWASP Foundation, 2021), the manipulation of PostGIS geometric operators—such as ST_DWithin, ST_Intersects, or ST_Buffer—presents little-addressed specificities: unsanitized input not only allows bypassing relational filters or exfiltrating data, but also triggering denial of service states through topological calculations with high algorithmic complexity.</w:t>
       </w:r>
     </w:p>
     <w:p>
@@ -390,15 +238,14 @@
         <w:spacing w:after="80" w:line="240" w:lineRule="auto"/>
         <w:ind w:firstLine="432"/>
       </w:pPr>
+      <w:r/>
       <w:r>
         <w:rPr>
           <w:rFonts w:ascii="Book Antiqua" w:hAnsi="Book Antiqua"/>
           <w:b w:val="0"/>
           <w:i w:val="0"/>
-          <w:color w:val="000000"/>
-          <w:sz w:val="22"/>
-        </w:rPr>
-        <w:t>This article presents an experimental evaluation of spatial SQL injection vulnerabilities in PostGIS-based cadastral systems. The study: (1) documents and evaluates six attack vectors mapped to the CIA triad (Confidentiality, Integrity, and Availability); (2) implements a reproducible testbed over an experimental dataset of 1,500 urban parcels structured under the ISO 19152 (LADM) standard; and (3) quantifies the latency and throughput impact of a mitigation architecture combining strongly typed ORM compilation (GeoAlchemy2) with pre-execution validation via Shapely and Pydantic.</w:t>
+        </w:rPr>
+        <w:t>This article presents an experimental evaluation of spatial SQL injection vulnerabilities in PostGIS-based cadastral information systems. The study: (1) documents and evaluates six attack vectors oriented to the CIA triad (Confidentiality, Integrity, and Availability); (2) implements a reproducible testbed on a dataset of 1,500 urban parcels structured under the ISO 19152 (LADM) standard; and (3) quantifies the impact on latency and throughput of a mitigation architecture based on typed ORM compilation (GeoAlchemy2) and prior validation with Shapely and Pydantic.</w:t>
       </w:r>
     </w:p>
     <w:p>
@@ -406,12 +253,12 @@
         <w:keepNext/>
         <w:spacing w:before="240" w:after="80"/>
       </w:pPr>
+      <w:r/>
       <w:r>
         <w:rPr>
           <w:rFonts w:ascii="Book Antiqua" w:hAnsi="Book Antiqua"/>
           <w:b/>
           <w:i w:val="0"/>
-          <w:color w:val="000000"/>
           <w:sz w:val="24"/>
         </w:rPr>
         <w:t>2. Related Work</w:t>
@@ -422,30 +269,28 @@
         <w:keepNext/>
         <w:spacing w:before="160" w:after="60"/>
       </w:pPr>
+      <w:r/>
       <w:r>
         <w:rPr>
           <w:rFonts w:ascii="Book Antiqua" w:hAnsi="Book Antiqua"/>
           <w:b/>
           <w:i w:val="0"/>
-          <w:color w:val="000000"/>
-          <w:sz w:val="22"/>
-        </w:rPr>
-        <w:t>2.1. Spatial SQL Injections and Topological Operators</w:t>
+        </w:rPr>
+        <w:t>2.1. SQL Injection in Spatial Engines and Topological Operators</w:t>
       </w:r>
     </w:p>
     <w:p>
       <w:pPr>
         <w:spacing w:after="80" w:line="240" w:lineRule="auto"/>
       </w:pPr>
+      <w:r/>
       <w:r>
         <w:rPr>
           <w:rFonts w:ascii="Book Antiqua" w:hAnsi="Book Antiqua"/>
           <w:b w:val="0"/>
           <w:i w:val="0"/>
-          <w:color w:val="000000"/>
-          <w:sz w:val="22"/>
-        </w:rPr>
-        <w:t>Seminal literature in computer security has established robust taxonomies for SQLi attacks. Halfond et al. (2006) categorized these threats into tautologies, union queries, blind injections, and stored procedure piggybacking. Clarke (2012) expanded upon this by examining the abstract syntax trees (AST) generated by database parsers when unsanitized parameters are concatenated. However, these classical frameworks fail to account for how spatial algebraic operators (Egenhofer, 1994) redefine logical evaluation conditions. Unlike scalar values, a geometric expression processes multiple dimensions, spatial reference system identifiers (SRID), and minimum bounding boxes, significantly expanding the syntactic escape surface. This theoretical gap in classical injection models leaves topological predicate manipulation in spatial relational engines unaddressed.</w:t>
+        </w:rPr>
+        <w:t>The foundational literature in computer security has established robust classifications for SQLi attacks. Halfond et al. (2006) classified these attacks into tautologies, union queries, blind injections, and stored procedure piggybacking. Clarke (2012) deepened the analysis of abstract syntax trees (AST) generated by database parsers when concatenating unsanitized parameters. However, these frameworks do not take into account the way spatial algebraic operators (Egenhofer, 1994) redefine logical evaluation conditions. Unlike a simple scalar value, a geometric expression processes multiple dimensions, spatial reference systems (SRID), and minimum bounding boxes, which expands the syntactic escape area. This theoretical gap in traditional injection models leaves the manipulation of native topological predicates in relational engines uncharacterized.</w:t>
       </w:r>
     </w:p>
     <w:p>
@@ -453,30 +298,28 @@
         <w:keepNext/>
         <w:spacing w:before="160" w:after="60"/>
       </w:pPr>
+      <w:r/>
       <w:r>
         <w:rPr>
           <w:rFonts w:ascii="Book Antiqua" w:hAnsi="Book Antiqua"/>
           <w:b/>
           <w:i w:val="0"/>
-          <w:color w:val="000000"/>
-          <w:sz w:val="22"/>
-        </w:rPr>
-        <w:t>2.2. Geospatial Access Control Models and Spatial Inference Breaches</w:t>
+        </w:rPr>
+        <w:t>2.2. Access Control Models and Geospatial Inference Breaches</w:t>
       </w:r>
     </w:p>
     <w:p>
       <w:pPr>
         <w:spacing w:after="80" w:line="240" w:lineRule="auto"/>
       </w:pPr>
+      <w:r/>
       <w:r>
         <w:rPr>
           <w:rFonts w:ascii="Book Antiqua" w:hAnsi="Book Antiqua"/>
           <w:b w:val="0"/>
           <w:i w:val="0"/>
-          <w:color w:val="000000"/>
-          <w:sz w:val="22"/>
-        </w:rPr>
-        <w:t>Access control in spatial databases was formally conceptualized by Bertino et al. (2005) through the GEO-RBAC (Spatially Aware Role-Based Access Control) model, demonstrating that read and write privileges must be dynamically subordinated to geographic boundaries. Complementarily, Chun and Atluri (2008) and Atluri and Chun (2004) investigated spatial inference risks in SDBMS, where unauthorized actors deduce the presence or attributes of protected spatial entities by correlating successive queries. Nevertheless, these approaches assume that the application layer faithfully projects spatial policies to persistence; in modern web architectures, unsafe concatenation directly nullifies persistence-tier access controls without detection by application-tier authorization mechanisms.</w:t>
+        </w:rPr>
+        <w:t>Access control in spatial databases was formally conceptualized by Bertino et al. (2005) through the GEO-RBAC (Spatially Aware Role-Based Access Control) model, which demonstrated that read and modification privileges must be subordinated to dynamic geographic boundaries. Complementarily, Chun and Atluri (2008) and Atluri and Chun (2004) analyzed spatial inference risks in SDBMS, where an unauthorized user can deduce the existence or attributes of a protected object by correlating successive spatial queries. However, these approaches assume that the service layer accurately transfers spatial policies to the database; in modern web architectures, insecure concatenation directly overrides persistence access control without being detected by application layer authorization mechanisms.</w:t>
       </w:r>
     </w:p>
     <w:p>
@@ -484,30 +327,28 @@
         <w:keepNext/>
         <w:spacing w:before="160" w:after="60"/>
       </w:pPr>
+      <w:r/>
       <w:r>
         <w:rPr>
           <w:rFonts w:ascii="Book Antiqua" w:hAnsi="Book Antiqua"/>
           <w:b/>
           <w:i w:val="0"/>
-          <w:color w:val="000000"/>
-          <w:sz w:val="22"/>
-        </w:rPr>
-        <w:t>2.3. Cadastral Integrity and Data Modeling under ISO 19152 (LADM)</w:t>
+        </w:rPr>
+        <w:t>2.3. Cadastral Integrity and Data Modeling under the LADM Standard</w:t>
       </w:r>
     </w:p>
     <w:p>
       <w:pPr>
         <w:spacing w:after="80" w:line="240" w:lineRule="auto"/>
       </w:pPr>
+      <w:r/>
       <w:r>
         <w:rPr>
           <w:rFonts w:ascii="Book Antiqua" w:hAnsi="Book Antiqua"/>
           <w:b w:val="0"/>
           <w:i w:val="0"/>
-          <w:color w:val="000000"/>
-          <w:sz w:val="22"/>
-        </w:rPr>
-        <w:t>The technical modeling of cadastral information systems is governed internationally by the ISO 19152:2012 standard, known as the Land Administration Domain Model (LADM). Foundational works by Lemmen et al. (2015) and van Oosterom et al. (2006) formalized core cadastral entities, prominently LA_SpatialUnit (parcels and lots) and LA_Party (property owners), subsequently extended toward automated mass valuation models (Kara et al., 2021). While the standard prescribes the semantics and interoperability of territorial and registry data, it omits query-level architectural safeguards against SQL injection attacks, leaving fiscal revenue and title tenure integrity exposed to software implementation flaws.</w:t>
+        </w:rPr>
+        <w:t>The ISO 19152:2012 standard, also known as the Land Administration Domain Model (LADM), regulates the technical modeling of cadastral information systems globally. Reference authors such as Lemmen et al. (2015) and van Oosterom et al. (2006) formalized the fundamental cadastral classes, highlighting LA_SpatialUnit (parcels and lots) and LA_Party (property owners), later extended to automated mass valuation models (Kara et al., 2021). Although the standard prescribes the semantics and interoperability of territorial and registry information, it does not define query-level architectural safeguards against SQL injection attacks, leaving the integrity of property rights and tax collection exposed to software implementation flaws.</w:t>
       </w:r>
     </w:p>
     <w:p>
@@ -515,13 +356,12 @@
         <w:keepNext/>
         <w:spacing w:before="160" w:after="60"/>
       </w:pPr>
+      <w:r/>
       <w:r>
         <w:rPr>
           <w:rFonts w:ascii="Book Antiqua" w:hAnsi="Book Antiqua"/>
           <w:b/>
           <w:i w:val="0"/>
-          <w:color w:val="000000"/>
-          <w:sz w:val="22"/>
         </w:rPr>
         <w:t>2.4. Algorithmic Complexity Attacks and Vulnerabilities in OGC Services</w:t>
       </w:r>
@@ -530,15 +370,14 @@
       <w:pPr>
         <w:spacing w:after="80" w:line="240" w:lineRule="auto"/>
       </w:pPr>
+      <w:r/>
       <w:r>
         <w:rPr>
           <w:rFonts w:ascii="Book Antiqua" w:hAnsi="Book Antiqua"/>
           <w:b w:val="0"/>
           <w:i w:val="0"/>
-          <w:color w:val="000000"/>
-          <w:sz w:val="22"/>
-        </w:rPr>
-        <w:t>The contemporary relevance of this threat was acutely illustrated in the software industry by critical vulnerability CVE-2023-25157 (CVSS score 9.8), wherein the reference software GeoServer allowed unauthenticated remote SQL injection via flawed evaluation of OGC filters and CQL expressions over PostGIS backends (National Vulnerability Database, 2023). In parallel, regarding denial of service, Crosby and Wallach (2003) established the paradigm of Algorithmic Complexity Attacks, demonstrating how engineered inputs can force worst-case execution paths (O(N^2)) to monopolize CPU resources. In spatial engines, as documented by Agarwal and Rajan (2016), computational geometry algorithms in PostGIS's underlying GEOS library exhibit quadratic computational overhead when evaluating complex polygons devoid of preliminary GiST spatial index filtering. Despite these precedents, the literature has neither quantified the resulting latency profiles nor formalized multi-tier defense schemes integrating API parsers with geometric engines.</w:t>
+        </w:rPr>
+        <w:t>The current relevance of this threat was demonstrated in the industry by the critical vulnerability CVE-2023-25157 (with a CVSS score of 9.8), where the reference software GeoServer allowed unauthenticated remote SQL execution through the insecure evaluation of OGC filters and CQL expressions over PostGIS databases (National Vulnerability Database, 2023). On the other hand, in the scope of denial of service, Crosby and Wallach (2003) established the concept of Algorithmic Complexity Attacks, demonstrating how crafted inputs can force worst-case algorithms (O(N^2)) to monopolize the CPU. In spatial engines, according to Agarwal and Rajan (2016), the computational algorithms of the GEOS library, integrated into PostGIS, demand quadratic computational overhead when executed on complex polygons without preliminary filtering by GiST spatial index. Despite these precedents, the literature has neither measured the latency impact nor formalized integrated defensive schemes between the web parser and the geometric engine.</w:t>
       </w:r>
     </w:p>
     <w:p>
@@ -546,12 +385,12 @@
         <w:keepNext/>
         <w:spacing w:before="240" w:after="80"/>
       </w:pPr>
+      <w:r/>
       <w:r>
         <w:rPr>
           <w:rFonts w:ascii="Book Antiqua" w:hAnsi="Book Antiqua"/>
           <w:b/>
           <w:i w:val="0"/>
-          <w:color w:val="000000"/>
           <w:sz w:val="24"/>
         </w:rPr>
         <w:t>3. Methodology</w:t>
@@ -562,30 +401,28 @@
         <w:keepNext/>
         <w:spacing w:before="160" w:after="60"/>
       </w:pPr>
+      <w:r/>
       <w:r>
         <w:rPr>
           <w:rFonts w:ascii="Book Antiqua" w:hAnsi="Book Antiqua"/>
           <w:b/>
           <w:i w:val="0"/>
-          <w:color w:val="000000"/>
-          <w:sz w:val="22"/>
-        </w:rPr>
-        <w:t>3.1. Research Approach and Experimental Framework</w:t>
+        </w:rPr>
+        <w:t>3.1. Approach and Experimental Design</w:t>
       </w:r>
     </w:p>
     <w:p>
       <w:pPr>
         <w:spacing w:after="80" w:line="240" w:lineRule="auto"/>
       </w:pPr>
+      <w:r/>
       <w:r>
         <w:rPr>
           <w:rFonts w:ascii="Book Antiqua" w:hAnsi="Book Antiqua"/>
           <w:b w:val="0"/>
           <w:i w:val="0"/>
-          <w:color w:val="000000"/>
-          <w:sz w:val="22"/>
-        </w:rPr>
-        <w:t>A quantitative, experimental design was adopted to evaluate the susceptibility of geospatial endpoints to SQL injections and measure the performance impact introduced by a multi-tier mitigation scheme. The evaluation compares two conditions: unprotected dynamic SQL queries versus ORM-compiled queries with prior geometric validation.</w:t>
+        </w:rPr>
+        <w:t>A quantitative experimental design was adopted to determine the vulnerability of geospatial endpoints to SQL injections and measure the performance impact resulting from a multilayer mitigation scheme. The evaluation considers two conditions: queries with unprotected dynamic SQL and queries compiled via ORM with prior geometry validation.</w:t>
       </w:r>
     </w:p>
     <w:p>
@@ -593,13 +430,12 @@
         <w:keepNext/>
         <w:spacing w:before="160" w:after="60"/>
       </w:pPr>
+      <w:r/>
       <w:r>
         <w:rPr>
           <w:rFonts w:ascii="Book Antiqua" w:hAnsi="Book Antiqua"/>
           <w:b/>
           <w:i w:val="0"/>
-          <w:color w:val="000000"/>
-          <w:sz w:val="22"/>
         </w:rPr>
         <w:t>3.2. Cadastral Dataset</w:t>
       </w:r>
@@ -608,15 +444,14 @@
       <w:pPr>
         <w:spacing w:after="80" w:line="240" w:lineRule="auto"/>
       </w:pPr>
+      <w:r/>
       <w:r>
         <w:rPr>
           <w:rFonts w:ascii="Book Antiqua" w:hAnsi="Book Antiqua"/>
           <w:b w:val="0"/>
           <w:i w:val="0"/>
-          <w:color w:val="000000"/>
-          <w:sz w:val="22"/>
-        </w:rPr>
-        <w:t>The experimental dataset comprises 1,500 contiguous urban cadastral parcels structured under the ISO 19152 standard (LADM, LA_SpatialUnit class) and georeferenced in EPSG:32719. The geometries exhibit a complexity ranging between 4 and 222 vertices (mean: 9.0 vertices per polygon). To ensure reproducibility and ethical safeguards, base cartography was retrieved from open sources and fiscal attributes were procedurally generated without incorporating personally identifiable information (PII).</w:t>
+        </w:rPr>
+        <w:t>The experimental dataset comprises 1,500 contiguous urban cadastral parcels structured under the ISO 19152 standard (LADM, class LA_SpatialUnit) and georeferenced in EPSG:32719. To ensure reproducibility and ethical safeguarding, the base cartography was obtained from open sources and fiscal attributes were procedurally generated without including real personal information.</w:t>
       </w:r>
     </w:p>
     <w:p>
@@ -624,13 +459,12 @@
         <w:keepNext/>
         <w:spacing w:before="160" w:after="60"/>
       </w:pPr>
+      <w:r/>
       <w:r>
         <w:rPr>
           <w:rFonts w:ascii="Book Antiqua" w:hAnsi="Book Antiqua"/>
           <w:b/>
           <w:i w:val="0"/>
-          <w:color w:val="000000"/>
-          <w:sz w:val="22"/>
         </w:rPr>
         <w:t>3.3. Experimental Environment and Architecture</w:t>
       </w:r>
@@ -639,15 +473,14 @@
       <w:pPr>
         <w:spacing w:after="80" w:line="240" w:lineRule="auto"/>
       </w:pPr>
+      <w:r/>
       <w:r>
         <w:rPr>
           <w:rFonts w:ascii="Book Antiqua" w:hAnsi="Book Antiqua"/>
           <w:b w:val="0"/>
           <w:i w:val="0"/>
-          <w:color w:val="000000"/>
-          <w:sz w:val="22"/>
-        </w:rPr>
-        <w:t>The testbed was implemented in Docker containers using isolated microservices: (1) a database service running PostgreSQL 15 and PostGIS 3.3, and (2) a Python 3.11 API with FastAPI and Uvicorn. Stress testing was executed in a controlled 14-core 5.2 GHz environment with 32 GB DDR5 RAM on Linux kernel 6.6 (WSL2).</w:t>
+        </w:rPr>
+        <w:t>The testbed was implemented in Docker containers using isolated microservices: (1) a database service with PostgreSQL 15 and PostGIS 3.3, and (2) an API in Python 3.11 with FastAPI and Uvicorn. Stress tests were executed in a controlled environment with an Intel Core Ultra 5 245KF processor of 14 cores at 5.2 GHz with 32 GB DDR5 RAM and NVMe PCIe 4.0 storage on Linux kernel 6.6 (WSL2).</w:t>
       </w:r>
     </w:p>
     <w:p>
@@ -655,13 +488,12 @@
         <w:keepNext/>
         <w:spacing w:before="160" w:after="60"/>
       </w:pPr>
+      <w:r/>
       <w:r>
         <w:rPr>
           <w:rFonts w:ascii="Book Antiqua" w:hAnsi="Book Antiqua"/>
           <w:b/>
           <w:i w:val="0"/>
-          <w:color w:val="000000"/>
-          <w:sz w:val="22"/>
         </w:rPr>
         <w:t>3.4. Test Vectors and Performance Metrics</w:t>
       </w:r>
@@ -670,15 +502,14 @@
       <w:pPr>
         <w:spacing w:after="80" w:line="240" w:lineRule="auto"/>
       </w:pPr>
+      <w:r/>
       <w:r>
         <w:rPr>
           <w:rFonts w:ascii="Book Antiqua" w:hAnsi="Book Antiqua"/>
           <w:b w:val="0"/>
           <w:i w:val="0"/>
-          <w:color w:val="000000"/>
-          <w:sz w:val="22"/>
-        </w:rPr>
-        <w:t>Six exploitation vectors based on the injection testing guidelines of the Web Security Testing Guide (OWASP Foundation, 2023), targeting the three dimensions of the CIA triad (Confidentiality, Integrity, and Availability, summarized in Appendix 1), were structured. Performance evaluation encompassed a 300-request load test and stepped concurrency curves (1 to 100 clients), recording latency metrics (mean, p50, p95, p99) and throughput (req/s).</w:t>
+        </w:rPr>
+        <w:t>Six exploitation vectors were structured based on the injection testing guidelines of the Web Security Testing Guide (OWASP Foundation, 2023), oriented to the three dimensions of the CIA triad (Confidentiality, Integrity, and Availability). The performance evaluation included a load of 300 requests and stepped concurrency curves (1 to 100 clients), recording latency metrics (mean, p50, p95, p99) and throughput (req/s).</w:t>
       </w:r>
     </w:p>
     <w:p>
@@ -686,12 +517,12 @@
         <w:keepNext/>
         <w:spacing w:before="240" w:after="80"/>
       </w:pPr>
+      <w:r/>
       <w:r>
         <w:rPr>
           <w:rFonts w:ascii="Book Antiqua" w:hAnsi="Book Antiqua"/>
           <w:b/>
           <w:i w:val="0"/>
-          <w:color w:val="000000"/>
           <w:sz w:val="24"/>
         </w:rPr>
         <w:t>4. Attack Simulations and Exploitation Results</w:t>
@@ -702,30 +533,28 @@
         <w:keepNext/>
         <w:spacing w:before="160" w:after="60"/>
       </w:pPr>
+      <w:r/>
       <w:r>
         <w:rPr>
           <w:rFonts w:ascii="Book Antiqua" w:hAnsi="Book Antiqua"/>
           <w:b/>
           <w:i w:val="0"/>
-          <w:color w:val="000000"/>
-          <w:sz w:val="22"/>
-        </w:rPr>
-        <w:t>4.1. Simulation 1: Spatial Logic Bypass</w:t>
+        </w:rPr>
+        <w:t>4.1. Simulation 1: Spatial Boundary Bypass (Spatial Logic Bypass)</w:t>
       </w:r>
     </w:p>
     <w:p>
       <w:pPr>
         <w:spacing w:after="80" w:line="240" w:lineRule="auto"/>
       </w:pPr>
+      <w:r/>
       <w:r>
         <w:rPr>
           <w:rFonts w:ascii="Book Antiqua" w:hAnsi="Book Antiqua"/>
           <w:b w:val="0"/>
           <w:i w:val="0"/>
-          <w:color w:val="000000"/>
-          <w:sz w:val="22"/>
-        </w:rPr>
-        <w:t>The endpoint GET /api/v1/vulnerable/predios/radio is designed to return cadastral lots within a 50-meter radius restricted strictly to sector 0101. By injecting the payload '50) OR (1=1' into the distance parameter, the lexical parser of PostgreSQL prematurely closes the ST_DWithin operator and introduces a tautology that nullifies both the spatial radius and territorial sector filters. As a result, the query transitioned from returning 1 authorized parcel to exfiltrating 50 unauthorized cadastral parcels in 7.03 ms. In the mitigated endpoint, Pydantic and GeoAlchemy2 strictly enforced numerical type boundaries, neutralizing the attack with HTTP 422.</w:t>
+        </w:rPr>
+        <w:t>The endpoint GET /api/v1/vulnerable/predios/radio is designed to return parcels within a 50-meter radius in sector 0101. By injecting the payload '50) OR (1=1' into the distance parameter, the PostgreSQL lexical analyzer prematurely closes the ST_DWithin operator and introduces a tautology that nullifies both the spatial boundary and the territorial sector filter. As a result, the query went from returning 1 authorized parcel to massively returning 50 unauthorized cadastral parcels in 7.03 ms. In the mitigated endpoint, Pydantic and GeoAlchemy2 verified strict numeric typing, neutralizing the attack with HTTP status code 422.</w:t>
       </w:r>
     </w:p>
     <w:p>
@@ -733,30 +562,28 @@
         <w:keepNext/>
         <w:spacing w:before="160" w:after="60"/>
       </w:pPr>
+      <w:r/>
       <w:r>
         <w:rPr>
           <w:rFonts w:ascii="Book Antiqua" w:hAnsi="Book Antiqua"/>
           <w:b/>
           <w:i w:val="0"/>
-          <w:color w:val="000000"/>
-          <w:sz w:val="22"/>
-        </w:rPr>
-        <w:t>4.2. Simulation 2: Data Inference via Geometric Error Channels (Error-Based Spatial SQLi)</w:t>
+        </w:rPr>
+        <w:t>4.2. Simulation 2: Data Inference through Geometric Errors (Error-Based Spatial SQLi)</w:t>
       </w:r>
     </w:p>
     <w:p>
       <w:pPr>
         <w:spacing w:after="80" w:line="240" w:lineRule="auto"/>
       </w:pPr>
+      <w:r/>
       <w:r>
         <w:rPr>
           <w:rFonts w:ascii="Book Antiqua" w:hAnsi="Book Antiqua"/>
           <w:b w:val="0"/>
           <w:i w:val="0"/>
-          <w:color w:val="000000"/>
-          <w:sz w:val="22"/>
-        </w:rPr>
-        <w:t>In the endpoint GET /api/v1/vulnerable/predios/poligono, the application renders cartographic polygons without exposing textual data. The attacker structured an inferential side-channel coupled to the ST_Intersects operator, injecting a conditional division by zero dependent on character guesses against the administrative table: if the guessed character matches, PostGIS raises a runtime exception triggering an HTTP 500 error; if false, the engine responds with HTTP 200. Through this mechanism, the full administrative credential 'admin' was exfiltrated in 42 seconds. In the mitigated version, Shapely evaluated topological validity in application memory, rejecting the malicious syntax with HTTP 422.</w:t>
+        </w:rPr>
+        <w:t>In the endpoint GET /api/v1/vulnerable/predios/poligono, the application draws cartographic polygons without exposing textual data. The attacker structured an inferential side channel coupled to the ST_Intersects operator, injecting a division by zero conditional on character guessing against the administrative table: if the guessed character matches, an exception occurs in PostGIS triggering an HTTP 500 error; if false, the engine responds with HTTP 200. Through this mechanism, the complete credential 'admin' was obtained in 42 seconds. In the mitigated version, Shapely evaluated topological validity in memory, rejecting the syntax with HTTP 422.</w:t>
       </w:r>
     </w:p>
     <w:p>
@@ -764,13 +591,12 @@
         <w:keepNext/>
         <w:spacing w:before="160" w:after="60"/>
       </w:pPr>
+      <w:r/>
       <w:r>
         <w:rPr>
           <w:rFonts w:ascii="Book Antiqua" w:hAnsi="Book Antiqua"/>
           <w:b/>
           <w:i w:val="0"/>
-          <w:color w:val="000000"/>
-          <w:sz w:val="22"/>
         </w:rPr>
         <w:t>4.3. Simulation 3: Spatial Denial of Service (Spatial DoS)</w:t>
       </w:r>
@@ -779,15 +605,14 @@
       <w:pPr>
         <w:spacing w:after="80" w:line="240" w:lineRule="auto"/>
       </w:pPr>
+      <w:r/>
       <w:r>
         <w:rPr>
           <w:rFonts w:ascii="Book Antiqua" w:hAnsi="Book Antiqua"/>
           <w:b w:val="0"/>
           <w:i w:val="0"/>
-          <w:color w:val="000000"/>
-          <w:sz w:val="22"/>
-        </w:rPr>
-        <w:t>Leveraging the baseline geometric complexity of cadastral parcels (averaging 9.0 vertices and up to 222 vertices per polygon), the attacker injected a subquery with an O(N^2) spatial Cartesian product into the endpoint GET /api/v1/vulnerable/predios/analisis-expansion, computing buffers with high segment densities per quadrant. As empirically evidenced in Figure 1, injecting the Cartesian product triggers an O(N^2) algorithmic complexity explosion that escalates latency from 10.8 ms up to 1,665.16 ms as evaluated buffer vertices expand from 14,400 to over 345,600 points, saturating PostgreSQL worker threads on the multi-core workstation. Conversely, the mitigated architecture reliably preserves a bounded latency of ~15 ms by constraining parameters to validated scalar ranges via Pydantic and GeoAlchemy2.</w:t>
+        </w:rPr>
+        <w:t>Leveraging the baseline geometric complexity of the parcels (average of 9.0 vertices and up to 222 vertices per polygon), the attacker injected a subquery with an O(N^2) spatial cross product into the endpoint GET /api/v1/vulnerable/predios/analisis-expansion that computes buffers with high segment density per quadrant. As evidenced in Figure 1, the injection of the Cartesian product triggers an O(N^2) algorithmic complexity explosion that raises latency from 10.8 ms up to 1,665.16 ms as evaluated buffer vertices grow from 14,400 to over 345,600 points, saturating PostgreSQL workers on the Intel Core Ultra 5 245KF processor. Conversely, the mitigated architecture preserves a bounded latency of ~15 ms by constraining parameters to validated scalars using Pydantic and GeoAlchemy2.</w:t>
       </w:r>
     </w:p>
     <w:p>
@@ -797,22 +622,26 @@
         <w:jc w:val="center"/>
       </w:pPr>
       <w:r>
+        <w:rPr>
+          <w:noProof/>
+        </w:rPr>
         <w:drawing>
-          <wp:inline xmlns:a="http://schemas.openxmlformats.org/drawingml/2006/main" xmlns:pic="http://schemas.openxmlformats.org/drawingml/2006/picture">
+          <wp:inline distT="0" distB="0" distL="0" distR="0" wp14:anchorId="2AF70EA5" wp14:editId="62F9A3A2">
             <wp:extent cx="4937760" cy="2852928"/>
+            <wp:effectExtent l="0" t="0" r="0" b="0"/>
             <wp:docPr id="1" name="Picture 1"/>
             <wp:cNvGraphicFramePr>
-              <a:graphicFrameLocks noChangeAspect="1"/>
+              <a:graphicFrameLocks xmlns:a="http://schemas.openxmlformats.org/drawingml/2006/main" noChangeAspect="1"/>
             </wp:cNvGraphicFramePr>
-            <a:graphic>
+            <a:graphic xmlns:a="http://schemas.openxmlformats.org/drawingml/2006/main">
               <a:graphicData uri="http://schemas.openxmlformats.org/drawingml/2006/picture">
-                <pic:pic>
+                <pic:pic xmlns:pic="http://schemas.openxmlformats.org/drawingml/2006/picture">
                   <pic:nvPicPr>
                     <pic:cNvPr id="0" name="fig3_spatial_dos_complexity.png"/>
                     <pic:cNvPicPr/>
                   </pic:nvPicPr>
                   <pic:blipFill>
-                    <a:blip r:embed="rId19"/>
+                    <a:blip r:embed="rId8"/>
                     <a:stretch>
                       <a:fillRect/>
                     </a:stretch>
@@ -822,7 +651,9 @@
                       <a:off x="0" y="0"/>
                       <a:ext cx="4937760" cy="2852928"/>
                     </a:xfrm>
-                    <a:prstGeom prst="rect"/>
+                    <a:prstGeom prst="rect">
+                      <a:avLst/>
+                    </a:prstGeom>
                   </pic:spPr>
                 </pic:pic>
               </a:graphicData>
@@ -836,12 +667,12 @@
         <w:spacing w:before="120" w:after="160"/>
         <w:jc w:val="center"/>
       </w:pPr>
+      <w:r/>
       <w:r>
         <w:rPr>
           <w:rFonts w:ascii="Book Antiqua" w:hAnsi="Book Antiqua"/>
           <w:b/>
           <w:i w:val="0"/>
-          <w:color w:val="000000"/>
           <w:sz w:val="20"/>
         </w:rPr>
         <w:t>Figure 1. Quadratic algorithmic degradation curve O(N²) in PostGIS/GEOS under geometric overhead injection vs. bounded mitigation</w:t>
@@ -852,30 +683,28 @@
         <w:keepNext/>
         <w:spacing w:before="160" w:after="60"/>
       </w:pPr>
+      <w:r/>
       <w:r>
         <w:rPr>
           <w:rFonts w:ascii="Book Antiqua" w:hAnsi="Book Antiqua"/>
           <w:b/>
           <w:i w:val="0"/>
-          <w:color w:val="000000"/>
-          <w:sz w:val="22"/>
-        </w:rPr>
-        <w:t>4.4. Simulation 4: Cadastral Record Tampering (Tax Assessment Manipulation)</w:t>
+        </w:rPr>
+        <w:t>4.4. Simulation 4: Cadastral Record Fraud (Property Tax Assessment Tampering)</w:t>
       </w:r>
     </w:p>
     <w:p>
       <w:pPr>
         <w:spacing w:after="80" w:line="240" w:lineRule="auto"/>
       </w:pPr>
+      <w:r/>
       <w:r>
         <w:rPr>
           <w:rFonts w:ascii="Book Antiqua" w:hAnsi="Book Antiqua"/>
           <w:b w:val="0"/>
           <w:i w:val="0"/>
-          <w:color w:val="000000"/>
-          <w:sz w:val="22"/>
-        </w:rPr>
-        <w:t>In the endpoint POST /api/v1/vulnerable/ficha/modificar, an attack against fiscal integrity was simulated. Through concatenation in the SET clause, the attacker manipulated the tax assessment setting it to S/ 0.00 and replaced the legitimate property owner with an unauthorized third party, proving the vulnerability of fiscal databases to direct update injections. The mitigated endpoint blocked the fraud via alphabetic regular expressions and positive range constraints in SQLAlchemy (HTTP 422).</w:t>
+        </w:rPr>
+        <w:t>In the endpoint POST /api/v1/vulnerable/ficha/modificar, an attack against data integrity was simulated. Through concatenation in the SET clause, the attacker manipulated the tax assessment setting it to S/ 0.00 and replaced the legitimate property owner with an unauthorized third party, demonstrating the vulnerability of fiscal databases to direct update injections. The mitigated endpoint blocked the fraud using alphabetic regular expressions and positive range validation in SQLAlchemy (HTTP 422).</w:t>
       </w:r>
     </w:p>
     <w:p>
@@ -883,30 +712,28 @@
         <w:keepNext/>
         <w:spacing w:before="160" w:after="60"/>
       </w:pPr>
+      <w:r/>
       <w:r>
         <w:rPr>
           <w:rFonts w:ascii="Book Antiqua" w:hAnsi="Book Antiqua"/>
           <w:b/>
           <w:i w:val="0"/>
-          <w:color w:val="000000"/>
-          <w:sz w:val="22"/>
-        </w:rPr>
-        <w:t>4.5. Simulation 5: Bulk Deletion of Cadastral Records (Data Destruction)</w:t>
+        </w:rPr>
+        <w:t>4.5. Simulation 5: Destructive Deletion of Cadastral Cartography (Data Destruction)</w:t>
       </w:r>
     </w:p>
     <w:p>
       <w:pPr>
         <w:spacing w:after="80" w:line="240" w:lineRule="auto"/>
       </w:pPr>
+      <w:r/>
       <w:r>
         <w:rPr>
           <w:rFonts w:ascii="Book Antiqua" w:hAnsi="Book Antiqua"/>
           <w:b w:val="0"/>
           <w:i w:val="0"/>
-          <w:color w:val="000000"/>
-          <w:sz w:val="22"/>
-        </w:rPr>
-        <w:t>In the endpoint DELETE /api/v1/vulnerable/predios/borrar, injecting the literal payload '0101' OR '1'='1' into the sector filter transformed the command into an unconditional record deletion (DELETE FROM tg_lote WHERE cod_sector = '0101' OR '1'='1'), purging all 1,500 parcels and leaving the web viewer devoid of cartography. In contrast, the mitigated endpoint validated the sector parameter using the strict regex pattern ^\d{4}$, rejecting the injection with HTTP 422 and preserving the cadastral repository intact.</w:t>
+        </w:rPr>
+        <w:t>In the endpoint DELETE /api/v1/vulnerable/predios/borrar, injecting the literal payload '0101' OR '1'='1' into the sector filtering parameter transformed the statement into an unconditional deletion of records (DELETE FROM tg_lote WHERE cod_sector = '0101' OR '1'='1'), deleting all 1,500 parcels and leaving the webmapping viewer without cartography. In contrast, the mitigated endpoint validated the sector using the strict pattern ^\d{4}$, rejecting the injection with HTTP code 422 and preserving the cadastral database.</w:t>
       </w:r>
     </w:p>
     <w:p>
@@ -914,30 +741,28 @@
         <w:keepNext/>
         <w:spacing w:before="160" w:after="60"/>
       </w:pPr>
+      <w:r/>
       <w:r>
         <w:rPr>
           <w:rFonts w:ascii="Book Antiqua" w:hAnsi="Book Antiqua"/>
           <w:b/>
           <w:i w:val="0"/>
-          <w:color w:val="000000"/>
-          <w:sz w:val="22"/>
-        </w:rPr>
-        <w:t>4.6. Simulation 6: Authentication Bypass in the Cadastral Web Viewer</w:t>
+        </w:rPr>
+        <w:t>4.6. Simulation 6: Authentication Bypass in the Cadastral Viewer</w:t>
       </w:r>
     </w:p>
     <w:p>
       <w:pPr>
         <w:spacing w:after="80" w:line="240" w:lineRule="auto"/>
       </w:pPr>
+      <w:r/>
       <w:r>
         <w:rPr>
           <w:rFonts w:ascii="Book Antiqua" w:hAnsi="Book Antiqua"/>
           <w:b w:val="0"/>
           <w:i w:val="0"/>
-          <w:color w:val="000000"/>
-          <w:sz w:val="22"/>
-        </w:rPr>
-        <w:t>In the endpoint POST /api/v1/vulnerable/auth/login, the attacker entered "admin' --" in the username field, commenting out password hash verification. The API granted immediate access and issued a token with the superadmin_catastro role. The mitigated version featuring prepared statements and SHA-256 cryptographic hashing neutralized the bypass by searching literally for the quoted string without evaluating it as SQL syntax.</w:t>
+        </w:rPr>
+        <w:t>In the endpoint POST /api/v1/vulnerable/auth/login, the attacker entered "admin' --" into the username field, commenting out the password hash validation. The API granted access and issued a token with the role superadmin_catastro. The mitigated version with prepared statements and SHA-256 cryptographic hashing neutralized the bypass by searching literally for the string with quotes without interpreting it as SQL syntax.</w:t>
       </w:r>
     </w:p>
     <w:p>
@@ -945,12 +770,12 @@
         <w:keepNext/>
         <w:spacing w:before="240" w:after="80"/>
       </w:pPr>
+      <w:r/>
       <w:r>
         <w:rPr>
           <w:rFonts w:ascii="Book Antiqua" w:hAnsi="Book Antiqua"/>
           <w:b/>
           <w:i w:val="0"/>
-          <w:color w:val="000000"/>
           <w:sz w:val="24"/>
         </w:rPr>
         <w:t>5. Mitigation Strategies and Performance Evaluation</w:t>
@@ -960,15 +785,14 @@
       <w:pPr>
         <w:spacing w:after="80" w:line="240" w:lineRule="auto"/>
       </w:pPr>
+      <w:r/>
       <w:r>
         <w:rPr>
           <w:rFonts w:ascii="Book Antiqua" w:hAnsi="Book Antiqua"/>
           <w:b w:val="0"/>
           <w:i w:val="0"/>
-          <w:color w:val="000000"/>
-          <w:sz w:val="22"/>
-        </w:rPr>
-        <w:t>As illustrated in Figure 2, the architectural mitigation integrated a three-barrier defense-in-depth pipeline: (1) Barrier 1 with Pydantic for strict typing and physical boundary constraints; (2) Barrier 2 with Shapely for topological validation and early rejection of degenerate geometries in application memory (returning HTTP 422 prior to database interaction); and (3) Barrier 3 with GeoAlchemy2 and SQLAlchemy for native compilation using binary bind variables (EWKB) and execution plan reuse (prepared statements).</w:t>
+        </w:rPr>
+        <w:t>As illustrated in Figure 2, the architectural mitigation integrated a defense-in-depth pipeline with three sequential barriers: (1) Barrier 1 with Pydantic for strict typing and bounding of physical limits; (2) Barrier 2 with Shapely for topological validation and discarding degenerate geometries in application memory (returning HTTP 422 before interacting with the database); and (3) Barrier 3 with GeoAlchemy2 and SQLAlchemy for native compilation using binary bind variables (EWKB) and reuse of execution plans (prepared statements).</w:t>
       </w:r>
     </w:p>
     <w:p>
@@ -978,22 +802,26 @@
         <w:jc w:val="center"/>
       </w:pPr>
       <w:r>
+        <w:rPr>
+          <w:noProof/>
+        </w:rPr>
         <w:drawing>
-          <wp:inline xmlns:a="http://schemas.openxmlformats.org/drawingml/2006/main" xmlns:pic="http://schemas.openxmlformats.org/drawingml/2006/picture">
+          <wp:inline distT="0" distB="0" distL="0" distR="0" wp14:anchorId="1E0779EF" wp14:editId="1FDD97DF">
             <wp:extent cx="5303520" cy="1856232"/>
+            <wp:effectExtent l="0" t="0" r="0" b="0"/>
             <wp:docPr id="2" name="Picture 2"/>
             <wp:cNvGraphicFramePr>
-              <a:graphicFrameLocks noChangeAspect="1"/>
+              <a:graphicFrameLocks xmlns:a="http://schemas.openxmlformats.org/drawingml/2006/main" noChangeAspect="1"/>
             </wp:cNvGraphicFramePr>
-            <a:graphic>
+            <a:graphic xmlns:a="http://schemas.openxmlformats.org/drawingml/2006/main">
               <a:graphicData uri="http://schemas.openxmlformats.org/drawingml/2006/picture">
-                <pic:pic>
+                <pic:pic xmlns:pic="http://schemas.openxmlformats.org/drawingml/2006/picture">
                   <pic:nvPicPr>
                     <pic:cNvPr id="0" name="fig1_defense_pipeline.png"/>
                     <pic:cNvPicPr/>
                   </pic:nvPicPr>
                   <pic:blipFill>
-                    <a:blip r:embed="rId20"/>
+                    <a:blip r:embed="rId9"/>
                     <a:stretch>
                       <a:fillRect/>
                     </a:stretch>
@@ -1003,7 +831,9 @@
                       <a:off x="0" y="0"/>
                       <a:ext cx="5303520" cy="1856232"/>
                     </a:xfrm>
-                    <a:prstGeom prst="rect"/>
+                    <a:prstGeom prst="rect">
+                      <a:avLst/>
+                    </a:prstGeom>
                   </pic:spPr>
                 </pic:pic>
               </a:graphicData>
@@ -1017,15 +847,15 @@
         <w:spacing w:before="120" w:after="160"/>
         <w:jc w:val="center"/>
       </w:pPr>
+      <w:r/>
       <w:r>
         <w:rPr>
           <w:rFonts w:ascii="Book Antiqua" w:hAnsi="Book Antiqua"/>
           <w:b/>
           <w:i w:val="0"/>
-          <w:color w:val="000000"/>
           <w:sz w:val="20"/>
         </w:rPr>
-        <w:t>Figure 2. Architecture of the 3-barrier defense-in-depth pipeline for PostGIS cadastral services</w:t>
+        <w:t>Figure 2. Architecture of the three-barrier defense-in-depth pipeline for cadastral services in PostGIS</w:t>
       </w:r>
     </w:p>
     <w:p>
@@ -1033,15 +863,14 @@
         <w:spacing w:after="80" w:line="240" w:lineRule="auto"/>
         <w:ind w:firstLine="432"/>
       </w:pPr>
+      <w:r/>
       <w:r>
         <w:rPr>
           <w:rFonts w:ascii="Book Antiqua" w:hAnsi="Book Antiqua"/>
           <w:b w:val="0"/>
           <w:i w:val="0"/>
-          <w:color w:val="000000"/>
-          <w:sz w:val="22"/>
-        </w:rPr>
-        <w:t>A comparative benchmark of 300 requests under 10 concurrent clients was conducted between the vulnerable API and the mitigated API. Results are summarized in Table 1.</w:t>
+        </w:rPr>
+        <w:t>A comparative load test of 300 requests with 10 concurrent clients was executed between the vulnerable API and the mitigated API. The results are summarized in Table 1.</w:t>
       </w:r>
     </w:p>
     <w:p>
@@ -1049,12 +878,12 @@
         <w:spacing w:before="160" w:after="80"/>
         <w:jc w:val="center"/>
       </w:pPr>
+      <w:r/>
       <w:r>
         <w:rPr>
           <w:rFonts w:ascii="Book Antiqua" w:hAnsi="Book Antiqua"/>
           <w:b/>
           <w:i w:val="0"/>
-          <w:color w:val="000000"/>
           <w:sz w:val="20"/>
         </w:rPr>
         <w:t>Table 1: Performance and Latency Comparison between Vulnerable API and Mitigated API</w:t>
@@ -1062,9 +891,9 @@
     </w:p>
     <w:tbl>
       <w:tblPr>
-        <w:tblW w:type="auto" w:w="0"/>
-        <w:jc w:val="center"/>
-        <w:tblLook w:firstColumn="1" w:firstRow="1" w:lastColumn="0" w:lastRow="0" w:noHBand="0" w:noVBand="1" w:val="04A0"/>
+        <w:tblStyle w:val="Tablanormal4"/>
+        <w:tblW w:w="0" w:type="auto"/>
+        <w:tblLook w:val="04A0" w:firstRow="1" w:lastRow="0" w:firstColumn="1" w:lastColumn="0" w:noHBand="0" w:noVBand="1"/>
       </w:tblPr>
       <w:tblGrid>
         <w:gridCol w:w="2052"/>
@@ -1073,21 +902,20 @@
         <w:gridCol w:w="2052"/>
       </w:tblGrid>
       <w:tr>
-        <w:tc>
-          <w:tcPr>
-            <w:tcW w:type="dxa" w:w="2052"/>
-          </w:tcPr>
-          <w:p>
-            <w:pPr>
-              <w:spacing w:before="40" w:after="40"/>
-              <w:jc w:val="left"/>
-            </w:pPr>
+        <w:trPr>
+          <w:cnfStyle w:val="100000000000" w:firstRow="1" w:lastRow="0" w:firstColumn="0" w:lastColumn="0" w:oddVBand="0" w:evenVBand="0" w:oddHBand="0" w:evenHBand="0" w:firstRowFirstColumn="0" w:firstRowLastColumn="0" w:lastRowFirstColumn="0" w:lastRowLastColumn="0"/>
+        </w:trPr>
+        <w:tc>
+          <w:tcPr>
+            <w:cnfStyle w:val="001000000000" w:firstRow="0" w:lastRow="0" w:firstColumn="1" w:lastColumn="0" w:oddVBand="0" w:evenVBand="0" w:oddHBand="0" w:evenHBand="0" w:firstRowFirstColumn="0" w:firstRowLastColumn="0" w:lastRowFirstColumn="0" w:lastRowLastColumn="0"/>
+            <w:tcW w:w="2052" w:type="dxa"/>
+          </w:tcPr>
+          <w:p>
+            <w:r/>
             <w:r>
               <w:rPr>
                 <w:rFonts w:ascii="Book Antiqua" w:hAnsi="Book Antiqua"/>
                 <w:b/>
-                <w:i w:val="0"/>
-                <w:color w:val="000000"/>
                 <w:sz w:val="20"/>
               </w:rPr>
               <w:t>Performance Metric</w:t>
@@ -1096,19 +924,14 @@
         </w:tc>
         <w:tc>
           <w:tcPr>
-            <w:tcW w:type="dxa" w:w="2052"/>
-          </w:tcPr>
-          <w:p>
-            <w:pPr>
-              <w:spacing w:before="40" w:after="40"/>
-              <w:jc w:val="center"/>
-            </w:pPr>
+            <w:tcW w:w="2052" w:type="dxa"/>
+          </w:tcPr>
+          <w:p>
+            <w:r/>
             <w:r>
               <w:rPr>
                 <w:rFonts w:ascii="Book Antiqua" w:hAnsi="Book Antiqua"/>
                 <w:b/>
-                <w:i w:val="0"/>
-                <w:color w:val="000000"/>
                 <w:sz w:val="20"/>
               </w:rPr>
               <w:t>Vulnerable API (Dynamic SQL)</w:t>
@@ -1117,19 +940,14 @@
         </w:tc>
         <w:tc>
           <w:tcPr>
-            <w:tcW w:type="dxa" w:w="2052"/>
-          </w:tcPr>
-          <w:p>
-            <w:pPr>
-              <w:spacing w:before="40" w:after="40"/>
-              <w:jc w:val="center"/>
-            </w:pPr>
+            <w:tcW w:w="2052" w:type="dxa"/>
+          </w:tcPr>
+          <w:p>
+            <w:r/>
             <w:r>
               <w:rPr>
                 <w:rFonts w:ascii="Book Antiqua" w:hAnsi="Book Antiqua"/>
                 <w:b/>
-                <w:i w:val="0"/>
-                <w:color w:val="000000"/>
                 <w:sz w:val="20"/>
               </w:rPr>
               <w:t>Mitigated API (GeoAlchemy2)</w:t>
@@ -1138,42 +956,36 @@
         </w:tc>
         <w:tc>
           <w:tcPr>
-            <w:tcW w:type="dxa" w:w="2052"/>
-          </w:tcPr>
-          <w:p>
-            <w:pPr>
-              <w:spacing w:before="40" w:after="40"/>
-              <w:jc w:val="center"/>
-            </w:pPr>
+            <w:tcW w:w="2052" w:type="dxa"/>
+          </w:tcPr>
+          <w:p>
+            <w:r/>
             <w:r>
               <w:rPr>
                 <w:rFonts w:ascii="Book Antiqua" w:hAnsi="Book Antiqua"/>
                 <w:b/>
-                <w:i w:val="0"/>
-                <w:color w:val="000000"/>
                 <w:sz w:val="20"/>
               </w:rPr>
-              <w:t>Variance (Overhead)</w:t>
+              <w:t>Variation (Overhead)</w:t>
             </w:r>
           </w:p>
         </w:tc>
       </w:tr>
       <w:tr>
-        <w:tc>
-          <w:tcPr>
-            <w:tcW w:type="dxa" w:w="2052"/>
-          </w:tcPr>
-          <w:p>
-            <w:pPr>
-              <w:spacing w:before="40" w:after="40"/>
-              <w:jc w:val="left"/>
-            </w:pPr>
+        <w:trPr>
+          <w:cnfStyle w:val="000000100000" w:firstRow="0" w:lastRow="0" w:firstColumn="0" w:lastColumn="0" w:oddVBand="0" w:evenVBand="0" w:oddHBand="1" w:evenHBand="0" w:firstRowFirstColumn="0" w:firstRowLastColumn="0" w:lastRowFirstColumn="0" w:lastRowLastColumn="0"/>
+        </w:trPr>
+        <w:tc>
+          <w:tcPr>
+            <w:cnfStyle w:val="001000000000" w:firstRow="0" w:lastRow="0" w:firstColumn="1" w:lastColumn="0" w:oddVBand="0" w:evenVBand="0" w:oddHBand="0" w:evenHBand="0" w:firstRowFirstColumn="0" w:firstRowLastColumn="0" w:lastRowFirstColumn="0" w:lastRowLastColumn="0"/>
+            <w:tcW w:w="2052" w:type="dxa"/>
+          </w:tcPr>
+          <w:p>
+            <w:r/>
             <w:r>
               <w:rPr>
                 <w:rFonts w:ascii="Book Antiqua" w:hAnsi="Book Antiqua"/>
                 <w:b w:val="0"/>
-                <w:i w:val="0"/>
-                <w:color w:val="000000"/>
                 <w:sz w:val="20"/>
               </w:rPr>
               <w:t>Throughput</w:t>
@@ -1182,19 +994,13 @@
         </w:tc>
         <w:tc>
           <w:tcPr>
-            <w:tcW w:type="dxa" w:w="2052"/>
-          </w:tcPr>
-          <w:p>
-            <w:pPr>
-              <w:spacing w:before="40" w:after="40"/>
-              <w:jc w:val="center"/>
-            </w:pPr>
-            <w:r>
-              <w:rPr>
-                <w:rFonts w:ascii="Book Antiqua" w:hAnsi="Book Antiqua"/>
-                <w:b w:val="0"/>
-                <w:i w:val="0"/>
-                <w:color w:val="000000"/>
+            <w:tcW w:w="2052" w:type="dxa"/>
+          </w:tcPr>
+          <w:p>
+            <w:r/>
+            <w:r>
+              <w:rPr>
+                <w:rFonts w:ascii="Book Antiqua" w:hAnsi="Book Antiqua"/>
                 <w:sz w:val="20"/>
               </w:rPr>
               <w:t>556.21 req/s</w:t>
@@ -1203,19 +1009,13 @@
         </w:tc>
         <w:tc>
           <w:tcPr>
-            <w:tcW w:type="dxa" w:w="2052"/>
-          </w:tcPr>
-          <w:p>
-            <w:pPr>
-              <w:spacing w:before="40" w:after="40"/>
-              <w:jc w:val="center"/>
-            </w:pPr>
-            <w:r>
-              <w:rPr>
-                <w:rFonts w:ascii="Book Antiqua" w:hAnsi="Book Antiqua"/>
-                <w:b w:val="0"/>
-                <w:i w:val="0"/>
-                <w:color w:val="000000"/>
+            <w:tcW w:w="2052" w:type="dxa"/>
+          </w:tcPr>
+          <w:p>
+            <w:r/>
+            <w:r>
+              <w:rPr>
+                <w:rFonts w:ascii="Book Antiqua" w:hAnsi="Book Antiqua"/>
                 <w:sz w:val="20"/>
               </w:rPr>
               <w:t>484.36 req/s</w:t>
@@ -1224,19 +1024,13 @@
         </w:tc>
         <w:tc>
           <w:tcPr>
-            <w:tcW w:type="dxa" w:w="2052"/>
-          </w:tcPr>
-          <w:p>
-            <w:pPr>
-              <w:spacing w:before="40" w:after="40"/>
-              <w:jc w:val="center"/>
-            </w:pPr>
-            <w:r>
-              <w:rPr>
-                <w:rFonts w:ascii="Book Antiqua" w:hAnsi="Book Antiqua"/>
-                <w:b w:val="0"/>
-                <w:i w:val="0"/>
-                <w:color w:val="000000"/>
+            <w:tcW w:w="2052" w:type="dxa"/>
+          </w:tcPr>
+          <w:p>
+            <w:r/>
+            <w:r>
+              <w:rPr>
+                <w:rFonts w:ascii="Book Antiqua" w:hAnsi="Book Antiqua"/>
                 <w:sz w:val="20"/>
               </w:rPr>
               <w:t>-71.85 req/s (-12.92%)</w:t>
@@ -1247,19 +1041,15 @@
       <w:tr>
         <w:tc>
           <w:tcPr>
-            <w:tcW w:type="dxa" w:w="2052"/>
-          </w:tcPr>
-          <w:p>
-            <w:pPr>
-              <w:spacing w:before="40" w:after="40"/>
-              <w:jc w:val="left"/>
-            </w:pPr>
+            <w:cnfStyle w:val="001000000000" w:firstRow="0" w:lastRow="0" w:firstColumn="1" w:lastColumn="0" w:oddVBand="0" w:evenVBand="0" w:oddHBand="0" w:evenHBand="0" w:firstRowFirstColumn="0" w:firstRowLastColumn="0" w:lastRowFirstColumn="0" w:lastRowLastColumn="0"/>
+            <w:tcW w:w="2052" w:type="dxa"/>
+          </w:tcPr>
+          <w:p>
+            <w:r/>
             <w:r>
               <w:rPr>
                 <w:rFonts w:ascii="Book Antiqua" w:hAnsi="Book Antiqua"/>
                 <w:b w:val="0"/>
-                <w:i w:val="0"/>
-                <w:color w:val="000000"/>
                 <w:sz w:val="20"/>
               </w:rPr>
               <w:t>Mean Latency</w:t>
@@ -1268,19 +1058,13 @@
         </w:tc>
         <w:tc>
           <w:tcPr>
-            <w:tcW w:type="dxa" w:w="2052"/>
-          </w:tcPr>
-          <w:p>
-            <w:pPr>
-              <w:spacing w:before="40" w:after="40"/>
-              <w:jc w:val="center"/>
-            </w:pPr>
-            <w:r>
-              <w:rPr>
-                <w:rFonts w:ascii="Book Antiqua" w:hAnsi="Book Antiqua"/>
-                <w:b w:val="0"/>
-                <w:i w:val="0"/>
-                <w:color w:val="000000"/>
+            <w:tcW w:w="2052" w:type="dxa"/>
+          </w:tcPr>
+          <w:p>
+            <w:r/>
+            <w:r>
+              <w:rPr>
+                <w:rFonts w:ascii="Book Antiqua" w:hAnsi="Book Antiqua"/>
                 <w:sz w:val="20"/>
               </w:rPr>
               <w:t>17.26 ms</w:t>
@@ -1289,19 +1073,13 @@
         </w:tc>
         <w:tc>
           <w:tcPr>
-            <w:tcW w:type="dxa" w:w="2052"/>
-          </w:tcPr>
-          <w:p>
-            <w:pPr>
-              <w:spacing w:before="40" w:after="40"/>
-              <w:jc w:val="center"/>
-            </w:pPr>
-            <w:r>
-              <w:rPr>
-                <w:rFonts w:ascii="Book Antiqua" w:hAnsi="Book Antiqua"/>
-                <w:b w:val="0"/>
-                <w:i w:val="0"/>
-                <w:color w:val="000000"/>
+            <w:tcW w:w="2052" w:type="dxa"/>
+          </w:tcPr>
+          <w:p>
+            <w:r/>
+            <w:r>
+              <w:rPr>
+                <w:rFonts w:ascii="Book Antiqua" w:hAnsi="Book Antiqua"/>
                 <w:sz w:val="20"/>
               </w:rPr>
               <w:t>19.89 ms</w:t>
@@ -1310,19 +1088,13 @@
         </w:tc>
         <w:tc>
           <w:tcPr>
-            <w:tcW w:type="dxa" w:w="2052"/>
-          </w:tcPr>
-          <w:p>
-            <w:pPr>
-              <w:spacing w:before="40" w:after="40"/>
-              <w:jc w:val="center"/>
-            </w:pPr>
-            <w:r>
-              <w:rPr>
-                <w:rFonts w:ascii="Book Antiqua" w:hAnsi="Book Antiqua"/>
-                <w:b w:val="0"/>
-                <w:i w:val="0"/>
-                <w:color w:val="000000"/>
+            <w:tcW w:w="2052" w:type="dxa"/>
+          </w:tcPr>
+          <w:p>
+            <w:r/>
+            <w:r>
+              <w:rPr>
+                <w:rFonts w:ascii="Book Antiqua" w:hAnsi="Book Antiqua"/>
                 <w:sz w:val="20"/>
               </w:rPr>
               <w:t>+2.63 ms (+15.24%)</w:t>
@@ -1331,21 +1103,20 @@
         </w:tc>
       </w:tr>
       <w:tr>
-        <w:tc>
-          <w:tcPr>
-            <w:tcW w:type="dxa" w:w="2052"/>
-          </w:tcPr>
-          <w:p>
-            <w:pPr>
-              <w:spacing w:before="40" w:after="40"/>
-              <w:jc w:val="left"/>
-            </w:pPr>
+        <w:trPr>
+          <w:cnfStyle w:val="000000100000" w:firstRow="0" w:lastRow="0" w:firstColumn="0" w:lastColumn="0" w:oddVBand="0" w:evenVBand="0" w:oddHBand="1" w:evenHBand="0" w:firstRowFirstColumn="0" w:firstRowLastColumn="0" w:lastRowFirstColumn="0" w:lastRowLastColumn="0"/>
+        </w:trPr>
+        <w:tc>
+          <w:tcPr>
+            <w:cnfStyle w:val="001000000000" w:firstRow="0" w:lastRow="0" w:firstColumn="1" w:lastColumn="0" w:oddVBand="0" w:evenVBand="0" w:oddHBand="0" w:evenHBand="0" w:firstRowFirstColumn="0" w:firstRowLastColumn="0" w:lastRowFirstColumn="0" w:lastRowLastColumn="0"/>
+            <w:tcW w:w="2052" w:type="dxa"/>
+          </w:tcPr>
+          <w:p>
+            <w:r/>
             <w:r>
               <w:rPr>
                 <w:rFonts w:ascii="Book Antiqua" w:hAnsi="Book Antiqua"/>
                 <w:b w:val="0"/>
-                <w:i w:val="0"/>
-                <w:color w:val="000000"/>
                 <w:sz w:val="20"/>
               </w:rPr>
               <w:t>50th Percentile (Median / p50)</w:t>
@@ -1354,19 +1125,13 @@
         </w:tc>
         <w:tc>
           <w:tcPr>
-            <w:tcW w:type="dxa" w:w="2052"/>
-          </w:tcPr>
-          <w:p>
-            <w:pPr>
-              <w:spacing w:before="40" w:after="40"/>
-              <w:jc w:val="center"/>
-            </w:pPr>
-            <w:r>
-              <w:rPr>
-                <w:rFonts w:ascii="Book Antiqua" w:hAnsi="Book Antiqua"/>
-                <w:b w:val="0"/>
-                <w:i w:val="0"/>
-                <w:color w:val="000000"/>
+            <w:tcW w:w="2052" w:type="dxa"/>
+          </w:tcPr>
+          <w:p>
+            <w:r/>
+            <w:r>
+              <w:rPr>
+                <w:rFonts w:ascii="Book Antiqua" w:hAnsi="Book Antiqua"/>
                 <w:sz w:val="20"/>
               </w:rPr>
               <w:t>15.37 ms</w:t>
@@ -1375,19 +1140,13 @@
         </w:tc>
         <w:tc>
           <w:tcPr>
-            <w:tcW w:type="dxa" w:w="2052"/>
-          </w:tcPr>
-          <w:p>
-            <w:pPr>
-              <w:spacing w:before="40" w:after="40"/>
-              <w:jc w:val="center"/>
-            </w:pPr>
-            <w:r>
-              <w:rPr>
-                <w:rFonts w:ascii="Book Antiqua" w:hAnsi="Book Antiqua"/>
-                <w:b w:val="0"/>
-                <w:i w:val="0"/>
-                <w:color w:val="000000"/>
+            <w:tcW w:w="2052" w:type="dxa"/>
+          </w:tcPr>
+          <w:p>
+            <w:r/>
+            <w:r>
+              <w:rPr>
+                <w:rFonts w:ascii="Book Antiqua" w:hAnsi="Book Antiqua"/>
                 <w:sz w:val="20"/>
               </w:rPr>
               <w:t>18.42 ms</w:t>
@@ -1396,19 +1155,13 @@
         </w:tc>
         <w:tc>
           <w:tcPr>
-            <w:tcW w:type="dxa" w:w="2052"/>
-          </w:tcPr>
-          <w:p>
-            <w:pPr>
-              <w:spacing w:before="40" w:after="40"/>
-              <w:jc w:val="center"/>
-            </w:pPr>
-            <w:r>
-              <w:rPr>
-                <w:rFonts w:ascii="Book Antiqua" w:hAnsi="Book Antiqua"/>
-                <w:b w:val="0"/>
-                <w:i w:val="0"/>
-                <w:color w:val="000000"/>
+            <w:tcW w:w="2052" w:type="dxa"/>
+          </w:tcPr>
+          <w:p>
+            <w:r/>
+            <w:r>
+              <w:rPr>
+                <w:rFonts w:ascii="Book Antiqua" w:hAnsi="Book Antiqua"/>
                 <w:sz w:val="20"/>
               </w:rPr>
               <w:t>+3.05 ms</w:t>
@@ -1419,19 +1172,15 @@
       <w:tr>
         <w:tc>
           <w:tcPr>
-            <w:tcW w:type="dxa" w:w="2052"/>
-          </w:tcPr>
-          <w:p>
-            <w:pPr>
-              <w:spacing w:before="40" w:after="40"/>
-              <w:jc w:val="left"/>
-            </w:pPr>
+            <w:cnfStyle w:val="001000000000" w:firstRow="0" w:lastRow="0" w:firstColumn="1" w:lastColumn="0" w:oddVBand="0" w:evenVBand="0" w:oddHBand="0" w:evenHBand="0" w:firstRowFirstColumn="0" w:firstRowLastColumn="0" w:lastRowFirstColumn="0" w:lastRowLastColumn="0"/>
+            <w:tcW w:w="2052" w:type="dxa"/>
+          </w:tcPr>
+          <w:p>
+            <w:r/>
             <w:r>
               <w:rPr>
                 <w:rFonts w:ascii="Book Antiqua" w:hAnsi="Book Antiqua"/>
                 <w:b w:val="0"/>
-                <w:i w:val="0"/>
-                <w:color w:val="000000"/>
                 <w:sz w:val="20"/>
               </w:rPr>
               <w:t>95th Percentile (p95)</w:t>
@@ -1440,19 +1189,13 @@
         </w:tc>
         <w:tc>
           <w:tcPr>
-            <w:tcW w:type="dxa" w:w="2052"/>
-          </w:tcPr>
-          <w:p>
-            <w:pPr>
-              <w:spacing w:before="40" w:after="40"/>
-              <w:jc w:val="center"/>
-            </w:pPr>
-            <w:r>
-              <w:rPr>
-                <w:rFonts w:ascii="Book Antiqua" w:hAnsi="Book Antiqua"/>
-                <w:b w:val="0"/>
-                <w:i w:val="0"/>
-                <w:color w:val="000000"/>
+            <w:tcW w:w="2052" w:type="dxa"/>
+          </w:tcPr>
+          <w:p>
+            <w:r/>
+            <w:r>
+              <w:rPr>
+                <w:rFonts w:ascii="Book Antiqua" w:hAnsi="Book Antiqua"/>
                 <w:sz w:val="20"/>
               </w:rPr>
               <w:t>31.49 ms</w:t>
@@ -1461,19 +1204,13 @@
         </w:tc>
         <w:tc>
           <w:tcPr>
-            <w:tcW w:type="dxa" w:w="2052"/>
-          </w:tcPr>
-          <w:p>
-            <w:pPr>
-              <w:spacing w:before="40" w:after="40"/>
-              <w:jc w:val="center"/>
-            </w:pPr>
-            <w:r>
-              <w:rPr>
-                <w:rFonts w:ascii="Book Antiqua" w:hAnsi="Book Antiqua"/>
-                <w:b w:val="0"/>
-                <w:i w:val="0"/>
-                <w:color w:val="000000"/>
+            <w:tcW w:w="2052" w:type="dxa"/>
+          </w:tcPr>
+          <w:p>
+            <w:r/>
+            <w:r>
+              <w:rPr>
+                <w:rFonts w:ascii="Book Antiqua" w:hAnsi="Book Antiqua"/>
                 <w:sz w:val="20"/>
               </w:rPr>
               <w:t>32.63 ms</w:t>
@@ -1482,19 +1219,13 @@
         </w:tc>
         <w:tc>
           <w:tcPr>
-            <w:tcW w:type="dxa" w:w="2052"/>
-          </w:tcPr>
-          <w:p>
-            <w:pPr>
-              <w:spacing w:before="40" w:after="40"/>
-              <w:jc w:val="center"/>
-            </w:pPr>
-            <w:r>
-              <w:rPr>
-                <w:rFonts w:ascii="Book Antiqua" w:hAnsi="Book Antiqua"/>
-                <w:b w:val="0"/>
-                <w:i w:val="0"/>
-                <w:color w:val="000000"/>
+            <w:tcW w:w="2052" w:type="dxa"/>
+          </w:tcPr>
+          <w:p>
+            <w:r/>
+            <w:r>
+              <w:rPr>
+                <w:rFonts w:ascii="Book Antiqua" w:hAnsi="Book Antiqua"/>
                 <w:sz w:val="20"/>
               </w:rPr>
               <w:t>+1.14 ms</w:t>
@@ -1503,21 +1234,20 @@
         </w:tc>
       </w:tr>
       <w:tr>
-        <w:tc>
-          <w:tcPr>
-            <w:tcW w:type="dxa" w:w="2052"/>
-          </w:tcPr>
-          <w:p>
-            <w:pPr>
-              <w:spacing w:before="40" w:after="40"/>
-              <w:jc w:val="left"/>
-            </w:pPr>
+        <w:trPr>
+          <w:cnfStyle w:val="000000100000" w:firstRow="0" w:lastRow="0" w:firstColumn="0" w:lastColumn="0" w:oddVBand="0" w:evenVBand="0" w:oddHBand="1" w:evenHBand="0" w:firstRowFirstColumn="0" w:firstRowLastColumn="0" w:lastRowFirstColumn="0" w:lastRowLastColumn="0"/>
+        </w:trPr>
+        <w:tc>
+          <w:tcPr>
+            <w:cnfStyle w:val="001000000000" w:firstRow="0" w:lastRow="0" w:firstColumn="1" w:lastColumn="0" w:oddVBand="0" w:evenVBand="0" w:oddHBand="0" w:evenHBand="0" w:firstRowFirstColumn="0" w:firstRowLastColumn="0" w:lastRowFirstColumn="0" w:lastRowLastColumn="0"/>
+            <w:tcW w:w="2052" w:type="dxa"/>
+          </w:tcPr>
+          <w:p>
+            <w:r/>
             <w:r>
               <w:rPr>
                 <w:rFonts w:ascii="Book Antiqua" w:hAnsi="Book Antiqua"/>
                 <w:b w:val="0"/>
-                <w:i w:val="0"/>
-                <w:color w:val="000000"/>
                 <w:sz w:val="20"/>
               </w:rPr>
               <w:t>99th Percentile (p99)</w:t>
@@ -1526,19 +1256,13 @@
         </w:tc>
         <w:tc>
           <w:tcPr>
-            <w:tcW w:type="dxa" w:w="2052"/>
-          </w:tcPr>
-          <w:p>
-            <w:pPr>
-              <w:spacing w:before="40" w:after="40"/>
-              <w:jc w:val="center"/>
-            </w:pPr>
-            <w:r>
-              <w:rPr>
-                <w:rFonts w:ascii="Book Antiqua" w:hAnsi="Book Antiqua"/>
-                <w:b w:val="0"/>
-                <w:i w:val="0"/>
-                <w:color w:val="000000"/>
+            <w:tcW w:w="2052" w:type="dxa"/>
+          </w:tcPr>
+          <w:p>
+            <w:r/>
+            <w:r>
+              <w:rPr>
+                <w:rFonts w:ascii="Book Antiqua" w:hAnsi="Book Antiqua"/>
                 <w:sz w:val="20"/>
               </w:rPr>
               <w:t>43.75 ms</w:t>
@@ -1547,19 +1271,13 @@
         </w:tc>
         <w:tc>
           <w:tcPr>
-            <w:tcW w:type="dxa" w:w="2052"/>
-          </w:tcPr>
-          <w:p>
-            <w:pPr>
-              <w:spacing w:before="40" w:after="40"/>
-              <w:jc w:val="center"/>
-            </w:pPr>
-            <w:r>
-              <w:rPr>
-                <w:rFonts w:ascii="Book Antiqua" w:hAnsi="Book Antiqua"/>
-                <w:b w:val="0"/>
-                <w:i w:val="0"/>
-                <w:color w:val="000000"/>
+            <w:tcW w:w="2052" w:type="dxa"/>
+          </w:tcPr>
+          <w:p>
+            <w:r/>
+            <w:r>
+              <w:rPr>
+                <w:rFonts w:ascii="Book Antiqua" w:hAnsi="Book Antiqua"/>
                 <w:sz w:val="20"/>
               </w:rPr>
               <w:t>38.24 ms</w:t>
@@ -1568,19 +1286,13 @@
         </w:tc>
         <w:tc>
           <w:tcPr>
-            <w:tcW w:type="dxa" w:w="2052"/>
-          </w:tcPr>
-          <w:p>
-            <w:pPr>
-              <w:spacing w:before="40" w:after="40"/>
-              <w:jc w:val="center"/>
-            </w:pPr>
-            <w:r>
-              <w:rPr>
-                <w:rFonts w:ascii="Book Antiqua" w:hAnsi="Book Antiqua"/>
-                <w:b w:val="0"/>
-                <w:i w:val="0"/>
-                <w:color w:val="000000"/>
+            <w:tcW w:w="2052" w:type="dxa"/>
+          </w:tcPr>
+          <w:p>
+            <w:r/>
+            <w:r>
+              <w:rPr>
+                <w:rFonts w:ascii="Book Antiqua" w:hAnsi="Book Antiqua"/>
                 <w:sz w:val="20"/>
               </w:rPr>
               <w:t>-5.51 ms (-12.59%)</w:t>
@@ -1591,40 +1303,30 @@
       <w:tr>
         <w:tc>
           <w:tcPr>
-            <w:tcW w:type="dxa" w:w="2052"/>
-          </w:tcPr>
-          <w:p>
-            <w:pPr>
-              <w:spacing w:before="40" w:after="40"/>
-              <w:jc w:val="left"/>
-            </w:pPr>
+            <w:cnfStyle w:val="001000000000" w:firstRow="0" w:lastRow="0" w:firstColumn="1" w:lastColumn="0" w:oddVBand="0" w:evenVBand="0" w:oddHBand="0" w:evenHBand="0" w:firstRowFirstColumn="0" w:firstRowLastColumn="0" w:lastRowFirstColumn="0" w:lastRowLastColumn="0"/>
+            <w:tcW w:w="2052" w:type="dxa"/>
+          </w:tcPr>
+          <w:p>
+            <w:r/>
             <w:r>
               <w:rPr>
                 <w:rFonts w:ascii="Book Antiqua" w:hAnsi="Book Antiqua"/>
                 <w:b w:val="0"/>
-                <w:i w:val="0"/>
-                <w:color w:val="000000"/>
                 <w:sz w:val="20"/>
               </w:rPr>
-              <w:t>Error Rate</w:t>
-            </w:r>
-          </w:p>
-        </w:tc>
-        <w:tc>
-          <w:tcPr>
-            <w:tcW w:type="dxa" w:w="2052"/>
-          </w:tcPr>
-          <w:p>
-            <w:pPr>
-              <w:spacing w:before="40" w:after="40"/>
-              <w:jc w:val="center"/>
-            </w:pPr>
-            <w:r>
-              <w:rPr>
-                <w:rFonts w:ascii="Book Antiqua" w:hAnsi="Book Antiqua"/>
-                <w:b w:val="0"/>
-                <w:i w:val="0"/>
-                <w:color w:val="000000"/>
+              <w:t>Failure Rate</w:t>
+            </w:r>
+          </w:p>
+        </w:tc>
+        <w:tc>
+          <w:tcPr>
+            <w:tcW w:w="2052" w:type="dxa"/>
+          </w:tcPr>
+          <w:p>
+            <w:r/>
+            <w:r>
+              <w:rPr>
+                <w:rFonts w:ascii="Book Antiqua" w:hAnsi="Book Antiqua"/>
                 <w:sz w:val="20"/>
               </w:rPr>
               <w:t>0.0%</w:t>
@@ -1633,19 +1335,13 @@
         </w:tc>
         <w:tc>
           <w:tcPr>
-            <w:tcW w:type="dxa" w:w="2052"/>
-          </w:tcPr>
-          <w:p>
-            <w:pPr>
-              <w:spacing w:before="40" w:after="40"/>
-              <w:jc w:val="center"/>
-            </w:pPr>
-            <w:r>
-              <w:rPr>
-                <w:rFonts w:ascii="Book Antiqua" w:hAnsi="Book Antiqua"/>
-                <w:b w:val="0"/>
-                <w:i w:val="0"/>
-                <w:color w:val="000000"/>
+            <w:tcW w:w="2052" w:type="dxa"/>
+          </w:tcPr>
+          <w:p>
+            <w:r/>
+            <w:r>
+              <w:rPr>
+                <w:rFonts w:ascii="Book Antiqua" w:hAnsi="Book Antiqua"/>
                 <w:sz w:val="20"/>
               </w:rPr>
               <w:t>0.0%</w:t>
@@ -1654,19 +1350,13 @@
         </w:tc>
         <w:tc>
           <w:tcPr>
-            <w:tcW w:type="dxa" w:w="2052"/>
-          </w:tcPr>
-          <w:p>
-            <w:pPr>
-              <w:spacing w:before="40" w:after="40"/>
-              <w:jc w:val="center"/>
-            </w:pPr>
-            <w:r>
-              <w:rPr>
-                <w:rFonts w:ascii="Book Antiqua" w:hAnsi="Book Antiqua"/>
-                <w:b w:val="0"/>
-                <w:i w:val="0"/>
-                <w:color w:val="000000"/>
+            <w:tcW w:w="2052" w:type="dxa"/>
+          </w:tcPr>
+          <w:p>
+            <w:r/>
+            <w:r>
+              <w:rPr>
+                <w:rFonts w:ascii="Book Antiqua" w:hAnsi="Book Antiqua"/>
                 <w:sz w:val="20"/>
               </w:rPr>
               <w:t>0.0%</w:t>
@@ -1679,15 +1369,15 @@
       <w:pPr>
         <w:spacing w:before="80" w:after="160"/>
       </w:pPr>
+      <w:r/>
       <w:r>
         <w:rPr>
           <w:rFonts w:ascii="Book Antiqua" w:hAnsi="Book Antiqua"/>
           <w:b w:val="0"/>
           <w:i/>
-          <w:color w:val="000000"/>
           <w:sz w:val="18"/>
         </w:rPr>
-        <w:t>Note: Empirical measurements gathered under 300 concurrent requests (concurrency=10) on a multi-core workstation with 32 GB DDR5 RAM in Docker Desktop (PostgreSQL 15 / PostGIS 3.3).</w:t>
+        <w:t>Note: Measurements collected under 300 concurrent requests (concurrency=10) on a workstation with an Intel Core Ultra 5 245KF processor, 32 GB DDR5 RAM, and NVMe PCIe 4.0 storage in Docker Desktop (PostgreSQL 15 / PostGIS 3.3).</w:t>
       </w:r>
     </w:p>
     <w:p>
@@ -1695,15 +1385,14 @@
         <w:spacing w:after="80" w:line="240" w:lineRule="auto"/>
         <w:ind w:firstLine="432"/>
       </w:pPr>
+      <w:r/>
       <w:r>
         <w:rPr>
           <w:rFonts w:ascii="Book Antiqua" w:hAnsi="Book Antiqua"/>
           <w:b w:val="0"/>
           <w:i w:val="0"/>
-          <w:color w:val="000000"/>
-          <w:sz w:val="22"/>
-        </w:rPr>
-        <w:t>To characterize resilience under progressive stress, a multi-tier concurrency benchmark spanning 1 to 100 concurrent clients was executed. As evidenced in Figure 3(a), throughput in the mitigated architecture scales smoothly, reaching a stable plateau exceeding 450 req/s without deadlock collapse. Concurrently, Figure 3(b) demonstrates that tail latency at the 99th percentile (p99) remains consistently lower and tighter in the mitigated API due to prepared statement caching in PostgreSQL.</w:t>
+        </w:rPr>
+        <w:t>To measure resilience under progressive stress, a stepped concurrency series of 1 to 100 clients was evaluated. As evidenced in Figure 3(a), the throughput of the mitigated architecture scales efficiently, reaching a stable plateau exceeding 450 req/s without degradation due to locks. Likewise, Figure 3(b) demonstrates that latency at the 99th percentile (p99) of the mitigated architecture remains systematically controlled and lower than that of the vulnerable version thanks to the reuse of execution plans in PostgreSQL.</w:t>
       </w:r>
     </w:p>
     <w:p>
@@ -1713,22 +1402,26 @@
         <w:jc w:val="center"/>
       </w:pPr>
       <w:r>
+        <w:rPr>
+          <w:noProof/>
+        </w:rPr>
         <w:drawing>
-          <wp:inline xmlns:a="http://schemas.openxmlformats.org/drawingml/2006/main" xmlns:pic="http://schemas.openxmlformats.org/drawingml/2006/picture">
+          <wp:inline distT="0" distB="0" distL="0" distR="0" wp14:anchorId="13181BE2" wp14:editId="1EF266B9">
             <wp:extent cx="5303520" cy="2039815"/>
+            <wp:effectExtent l="0" t="0" r="0" b="0"/>
             <wp:docPr id="3" name="Picture 3"/>
             <wp:cNvGraphicFramePr>
-              <a:graphicFrameLocks noChangeAspect="1"/>
+              <a:graphicFrameLocks xmlns:a="http://schemas.openxmlformats.org/drawingml/2006/main" noChangeAspect="1"/>
             </wp:cNvGraphicFramePr>
-            <a:graphic>
+            <a:graphic xmlns:a="http://schemas.openxmlformats.org/drawingml/2006/main">
               <a:graphicData uri="http://schemas.openxmlformats.org/drawingml/2006/picture">
-                <pic:pic>
+                <pic:pic xmlns:pic="http://schemas.openxmlformats.org/drawingml/2006/picture">
                   <pic:nvPicPr>
                     <pic:cNvPr id="0" name="fig2_concurrency_latency.png"/>
                     <pic:cNvPicPr/>
                   </pic:nvPicPr>
                   <pic:blipFill>
-                    <a:blip r:embed="rId21"/>
+                    <a:blip r:embed="rId10"/>
                     <a:stretch>
                       <a:fillRect/>
                     </a:stretch>
@@ -1738,7 +1431,9 @@
                       <a:off x="0" y="0"/>
                       <a:ext cx="5303520" cy="2039815"/>
                     </a:xfrm>
-                    <a:prstGeom prst="rect"/>
+                    <a:prstGeom prst="rect">
+                      <a:avLst/>
+                    </a:prstGeom>
                   </pic:spPr>
                 </pic:pic>
               </a:graphicData>
@@ -1752,15 +1447,15 @@
         <w:spacing w:before="120" w:after="160"/>
         <w:jc w:val="center"/>
       </w:pPr>
+      <w:r/>
       <w:r>
         <w:rPr>
           <w:rFonts w:ascii="Book Antiqua" w:hAnsi="Book Antiqua"/>
           <w:b/>
           <w:i w:val="0"/>
-          <w:color w:val="000000"/>
           <w:sz w:val="20"/>
         </w:rPr>
-        <w:t>Figure 3. Empirical throughput and latency percentiles (p50 and p99) comparison under scaled concurrency (1 to 100 clients)</w:t>
+        <w:t>Figure 3. Empirical comparison of performance (Throughput) and latency percentiles (p50 and p99) under stepped concurrency (1 to 100 clients)</w:t>
       </w:r>
     </w:p>
     <w:p>
@@ -1768,12 +1463,12 @@
         <w:keepNext/>
         <w:spacing w:before="240" w:after="80"/>
       </w:pPr>
+      <w:r/>
       <w:r>
         <w:rPr>
           <w:rFonts w:ascii="Book Antiqua" w:hAnsi="Book Antiqua"/>
           <w:b/>
           <w:i w:val="0"/>
-          <w:color w:val="000000"/>
           <w:sz w:val="24"/>
         </w:rPr>
         <w:t>6. Discussion</w:t>
@@ -1783,15 +1478,14 @@
       <w:pPr>
         <w:spacing w:after="80" w:line="240" w:lineRule="auto"/>
       </w:pPr>
+      <w:r/>
       <w:r>
         <w:rPr>
           <w:rFonts w:ascii="Book Antiqua" w:hAnsi="Book Antiqua"/>
           <w:b w:val="0"/>
           <w:i w:val="0"/>
-          <w:color w:val="000000"/>
-          <w:sz w:val="22"/>
-        </w:rPr>
-        <w:t>The empirical results demonstrate that mitigation based on GeoAlchemy2 and pre-execution validation with Shapely introduces a mean latency overhead of merely 2.63 milliseconds per request (+15.24%), sustaining a throughput of 484.36 requests per second. Particularly noteworthy is the reduction in tail latency at the 99th percentile (p99), which dropped from 43.75 ms to 38.24 ms (-12.59%), an optimization directly attributed to efficient reuse of compiled execution plans (prepared statements) in PostgreSQL by eliminating continuous re-parsing of dynamic queries. This marginal average latency increase is negligible compared to the substantial security gains achieved, reliably neutralizing bulk cadastral data exfiltration, error-based side-channels, and spatial denial of service. It is concluded that traditional WAFs are ineffective against spatial payloads, necessitating spatially aware syntactic validation mechanisms embedded directly within application code.</w:t>
+        </w:rPr>
+        <w:t>The experimental test results demonstrate that the proposed architecture (GeoAlchemy2 alongside prior validation in Shapely) introduces an average latency overhead of 2.63 ms per request (+15.24%), maintaining a processing rate of 484.36 req/s. A relevant aspect for software design is the behavior at the 99th percentile (p99): tail latency decreased from 43.75 ms to 38.24 ms, representing a 12.59% improvement in service stability. This optimization is due to PostgreSQL reusing in-memory execution plans (prepared statements), eliminating the recurring cost of re-parsing dynamic queries syntactically.</w:t>
       </w:r>
     </w:p>
     <w:p>
@@ -1799,15 +1493,14 @@
         <w:spacing w:after="80" w:line="240" w:lineRule="auto"/>
         <w:ind w:firstLine="432"/>
       </w:pPr>
+      <w:r/>
       <w:r>
         <w:rPr>
           <w:rFonts w:ascii="Book Antiqua" w:hAnsi="Book Antiqua"/>
           <w:b w:val="0"/>
           <w:i w:val="0"/>
-          <w:color w:val="000000"/>
-          <w:sz w:val="22"/>
-        </w:rPr>
-        <w:t>Figure 4 summarizes the attack mitigation and blocking rate (%) across the six evaluated vectors, contrasting an unprotected architecture, a traditional signature-based WAF (OWASP ModSecurity Core Rule Set), and the proposed pipeline. Whereas the generic WAF fails to identify spatial attacks (achieving only 0% to 20% blocking on topological vectors such as ST_DWithin and ST_Intersects due to the lack of geospatial grammar awareness), the three-barrier pipeline achieves a complete 100% blocking rate across all evaluated vectors of the CIA triad.</w:t>
+        </w:rPr>
+        <w:t>This average overhead is acceptable given the protection guarantees obtained: it neutralizes massive parcel leakage, error-based side channels, and denial of service. As illustrated in Figure 4, traditional web application firewalls (signature-based WAFs such as OWASP CRS) lack geospatial grammar and block only between 0% and 20% of topological injections (ST_DWithin and ST_Intersects). In contrast, the three-barrier pipeline implemented at the application layer achieved a 100% mitigation rate across all evaluated vectors of the CIA triad.</w:t>
       </w:r>
     </w:p>
     <w:p>
@@ -1817,22 +1510,26 @@
         <w:jc w:val="center"/>
       </w:pPr>
       <w:r>
+        <w:rPr>
+          <w:noProof/>
+        </w:rPr>
         <w:drawing>
-          <wp:inline xmlns:a="http://schemas.openxmlformats.org/drawingml/2006/main" xmlns:pic="http://schemas.openxmlformats.org/drawingml/2006/picture">
+          <wp:inline distT="0" distB="0" distL="0" distR="0" wp14:anchorId="545B94D5" wp14:editId="5869901C">
             <wp:extent cx="5303520" cy="2209800"/>
+            <wp:effectExtent l="0" t="0" r="0" b="0"/>
             <wp:docPr id="4" name="Picture 4"/>
             <wp:cNvGraphicFramePr>
-              <a:graphicFrameLocks noChangeAspect="1"/>
+              <a:graphicFrameLocks xmlns:a="http://schemas.openxmlformats.org/drawingml/2006/main" noChangeAspect="1"/>
             </wp:cNvGraphicFramePr>
-            <a:graphic>
+            <a:graphic xmlns:a="http://schemas.openxmlformats.org/drawingml/2006/main">
               <a:graphicData uri="http://schemas.openxmlformats.org/drawingml/2006/picture">
-                <pic:pic>
+                <pic:pic xmlns:pic="http://schemas.openxmlformats.org/drawingml/2006/picture">
                   <pic:nvPicPr>
                     <pic:cNvPr id="0" name="fig4_attack_mitigation_matrix.png"/>
                     <pic:cNvPicPr/>
                   </pic:nvPicPr>
                   <pic:blipFill>
-                    <a:blip r:embed="rId22"/>
+                    <a:blip r:embed="rId11"/>
                     <a:stretch>
                       <a:fillRect/>
                     </a:stretch>
@@ -1842,7 +1539,9 @@
                       <a:off x="0" y="0"/>
                       <a:ext cx="5303520" cy="2209800"/>
                     </a:xfrm>
-                    <a:prstGeom prst="rect"/>
+                    <a:prstGeom prst="rect">
+                      <a:avLst/>
+                    </a:prstGeom>
                   </pic:spPr>
                 </pic:pic>
               </a:graphicData>
@@ -1856,15 +1555,15 @@
         <w:spacing w:before="120" w:after="160"/>
         <w:jc w:val="center"/>
       </w:pPr>
+      <w:r/>
       <w:r>
         <w:rPr>
           <w:rFonts w:ascii="Book Antiqua" w:hAnsi="Book Antiqua"/>
           <w:b/>
           <w:i w:val="0"/>
-          <w:color w:val="000000"/>
           <w:sz w:val="20"/>
         </w:rPr>
-        <w:t>Figure 4. Attack mitigation and blocking rate (%) across unprotected architecture, traditional WAF (OWASP CRS), and the proposed pipeline</w:t>
+        <w:t>Figure 4. Attack mitigation and blocking rate (%) across unprotected architecture, traditional WAF (OWASP CRS), and proposed pipeline</w:t>
       </w:r>
     </w:p>
     <w:p>
@@ -1872,13 +1571,12 @@
         <w:spacing w:after="80" w:line="240" w:lineRule="auto"/>
         <w:ind w:firstLine="432"/>
       </w:pPr>
+      <w:r/>
       <w:r>
         <w:rPr>
           <w:rFonts w:ascii="Book Antiqua" w:hAnsi="Book Antiqua"/>
           <w:b/>
           <w:i w:val="0"/>
-          <w:color w:val="000000"/>
-          <w:sz w:val="22"/>
         </w:rPr>
         <w:t xml:space="preserve">Platform independence and benchmarking validity. </w:t>
       </w:r>
@@ -1887,10 +1585,8 @@
           <w:rFonts w:ascii="Book Antiqua" w:hAnsi="Book Antiqua"/>
           <w:b w:val="0"/>
           <w:i w:val="0"/>
-          <w:color w:val="000000"/>
-          <w:sz w:val="22"/>
-        </w:rPr>
-        <w:t>While absolute latency metrics were acquired on a modern multi-core workstation, the methodological validity and generalizability of the findings reside in the relative proportions (+15.24% mean overhead and -12.59% p99 tail improvement) and in computational asymptotic complexities. On municipal servers or cloud instances with restricted hardware resources (common in local government environments), the computational cost of Python preprocessing (GeoAlchemy2/Shapely) remains negligible relative to dominant disk I/O and relational concurrency bottlenecks. Conversely, the absence of defenses against algorithmic complexity attacks (O(N^2)) such as Spatial DoS (Simulation 3) proves critical on entry-level processors with lower parallelism, where a small number of malicious queries can immediately incapacitate the entire cadastral service.</w:t>
+        </w:rPr>
+        <w:t>Although absolute latency values depend on the baseline test hardware, the methodological validity and generalizability of the results reside in the relative proportions (+15.24% average overhead and -12.59% improvement in p99) and asymptotic complexities. On municipal servers or cloud instances with constrained resources, the computational consumption of prior validation in Python (GeoAlchemy2 and Shapely) is marginal compared to disk access latency and relational concurrency. Conversely, omitting mitigation against quadratic complexity attacks (O(N^2)), such as spatial DoS (Simulation 3), exposes processors with lower parallelism to immediate saturation, where a small number of malicious requests completely locks the cadastral geoportal.</w:t>
       </w:r>
     </w:p>
     <w:p>
@@ -1898,25 +1594,22 @@
         <w:spacing w:after="80" w:line="240" w:lineRule="auto"/>
         <w:ind w:firstLine="432"/>
       </w:pPr>
+      <w:r/>
       <w:r>
         <w:rPr>
           <w:rFonts w:ascii="Book Antiqua" w:hAnsi="Book Antiqua"/>
           <w:b/>
           <w:i w:val="0"/>
-          <w:color w:val="000000"/>
-          <w:sz w:val="22"/>
-        </w:rPr>
-        <w:t xml:space="preserve">Systemic impact on the integrity of cadastral procedures and records. </w:t>
+        </w:rPr>
+        <w:t xml:space="preserve">Systemic impact on the integrity of cadastral procedures and data. </w:t>
       </w:r>
       <w:r>
         <w:rPr>
           <w:rFonts w:ascii="Book Antiqua" w:hAnsi="Book Antiqua"/>
           <w:b w:val="0"/>
           <w:i w:val="0"/>
-          <w:color w:val="000000"/>
-          <w:sz w:val="22"/>
-        </w:rPr>
-        <w:t>The empirical feasibility of Simulation 4 (tampering with property valuation and ownership via direct injection) illustrates how a persistence-level failure transcends single-table corruption and compromises the validity of municipal e-government operations. When cadastral systems interoperate autonomously to issue cryptographic QR-verified cadastral certificates, tax clearance certificates, or property conveyance deeds under ISO 19152 LADM, injecting arbitrary data into catastro_titulares and tg_lote propagates fiscal and registry inconsistencies without triggering UI-tier alerts, confirming that strongly typed ORM sanitization is an indispensable safeguard for the reliability of digital public services.</w:t>
+        </w:rPr>
+        <w:t>The feasibility of fraud in property tax assessments and ownership (Simulation 4) demonstrates that an injection in the persistence layer transcends the modification of an isolated table and compromises property information. Currently, geoportals interoperate autonomously to issue cadastral certificates with QR codes, tax clearance certificates, and property transfers under the ISO 19152 (LADM) standard. The injection of arbitrary data into catastro_titulares and tg_lote propagates legal and fiscal inconsistencies into these official documents without generating alerts in the user interface. This scenario confirms that strict typing in the ORM is an indispensable protection to preserve the legitimacy and traceability of digital public services.</w:t>
       </w:r>
     </w:p>
     <w:p>
@@ -1924,12 +1617,12 @@
         <w:keepNext/>
         <w:spacing w:before="240" w:after="80"/>
       </w:pPr>
+      <w:r/>
       <w:r>
         <w:rPr>
           <w:rFonts w:ascii="Book Antiqua" w:hAnsi="Book Antiqua"/>
           <w:b/>
           <w:i w:val="0"/>
-          <w:color w:val="000000"/>
           <w:sz w:val="24"/>
         </w:rPr>
         <w:t>7. Conclusions and Recommendations</w:t>
@@ -1938,16 +1631,16 @@
     <w:p>
       <w:pPr>
         <w:spacing w:after="80" w:line="240" w:lineRule="auto"/>
-      </w:pPr>
+        <w:ind w:firstLine="432"/>
+      </w:pPr>
+      <w:r/>
       <w:r>
         <w:rPr>
           <w:rFonts w:ascii="Book Antiqua" w:hAnsi="Book Antiqua"/>
           <w:b w:val="0"/>
           <w:i w:val="0"/>
-          <w:color w:val="000000"/>
-          <w:sz w:val="22"/>
-        </w:rPr>
-        <w:t>This article formalized and empirically demonstrated the viability of six spatial SQL injection vectors targeting the CIA triad (Confidentiality, Integrity, and Availability) in PostGIS-based cadastral information systems, proving that native topological functions offer no data isolation guarantees when constructed via string concatenation. Experimental evaluation over a dataset of 1,500 cadastral parcels structured under the ISO 19152 (LADM) standard confirmed that unauthenticated adversaries can bypass territorial boundaries, reconstruct credentials through geometric error side-channels, induce denial of service via quadratic algorithmic overhead, tamper with fiscal property records, and execute bulk cartographic deletions. In response, the defense-in-depth architecture based on typed ORM compilation (GeoAlchemy2), rigid typing with Pydantic, and in-memory pre-validation with Shapely successfully mitigated 100% of the evaluated exploitation scenarios. Transactional benchmarking demonstrated that this scheme introduces a mean latency overhead of only 2.63 ms (+15.24%), while simultaneously enhancing 99th-percentile stability by 12.59% through execution plan reuse in PostgreSQL. In conclusion, securing cadastral infrastructures requires abandoning traditional scalar sanitization paradigms in favor of ORM parameterization and spatially aware syntactic controls integrated from the foundational software architecture design.</w:t>
+        </w:rPr>
+        <w:t>This article formalized and empirically demonstrated the viability of six spatial SQL injection vectors oriented to the CIA triad (Confidentiality, Integrity, and Availability) in PostGIS-based cadastral information systems, showing that native topological functions do not guarantee data isolation when constructed through string concatenation. The experimental evaluation on a dataset of 1,500 cadastral parcels structured under the ISO 19152 (LADM) standard verified that an attacker can bypass zonal boundaries, reconstruct credentials through geometric error side channels, induce denial of service through quadratic algorithmic overhead, alter property tax records, and execute bulk cartographic deletions. In response, the defense-in-depth architecture based on typed compilation through ORM (GeoAlchemy2), rigid typing with Pydantic, and prior topological validation in memory with Shapely successfully mitigated 100% of the evaluated exploitation scenarios. Transactional benchmarking demonstrated that this scheme introduces an average latency overhead of 2.63 ms (+15.24%), simultaneously improving stability at the 99th percentile by 12.59% thanks to the reuse of prepared execution plans in PostgreSQL. In conclusion, security in cadastral infrastructures requires abandoning the traditional scalar sanitization paradigm, adopting parameterization in the ORM and spatially aware syntactic controls integrated from the architectural software design.</w:t>
       </w:r>
     </w:p>
     <w:p>
@@ -1955,12 +1648,12 @@
         <w:keepNext/>
         <w:spacing w:before="240" w:after="80"/>
       </w:pPr>
+      <w:r/>
       <w:r>
         <w:rPr>
           <w:rFonts w:ascii="Book Antiqua" w:hAnsi="Book Antiqua"/>
           <w:b/>
           <w:i w:val="0"/>
-          <w:color w:val="000000"/>
           <w:sz w:val="24"/>
         </w:rPr>
         <w:t>8. References</w:t>
@@ -1974,9 +1667,12 @@
       <w:r>
         <w:rPr>
           <w:rFonts w:ascii="Book Antiqua" w:hAnsi="Book Antiqua"/>
-          <w:b w:val="0"/>
-          <w:i w:val="0"/>
           <w:color w:val="000000"/>
+        </w:rPr>
+      </w:r>
+      <w:r>
+        <w:rPr>
+          <w:rFonts w:ascii="Book Antiqua" w:hAnsi="Book Antiqua"/>
           <w:sz w:val="22"/>
         </w:rPr>
         <w:t>Agarwal, S., &amp; Rajan, K. S. (2016). Performance analysis of MongoDB versus PostGIS/PostgreSQL databases for line intersection and point containment spatial queries. Spatial Information Research, 24(6), 669–677. https://doi.org/10.1007/s41324-016-0059-1</w:t>
@@ -1990,9 +1686,12 @@
       <w:r>
         <w:rPr>
           <w:rFonts w:ascii="Book Antiqua" w:hAnsi="Book Antiqua"/>
-          <w:b w:val="0"/>
-          <w:i w:val="0"/>
           <w:color w:val="000000"/>
+        </w:rPr>
+      </w:r>
+      <w:r>
+        <w:rPr>
+          <w:rFonts w:ascii="Book Antiqua" w:hAnsi="Book Antiqua"/>
           <w:sz w:val="22"/>
         </w:rPr>
         <w:t>Atluri, V., &amp; Chun, S. A. (2004). An authorization model for geospatial data. IEEE Transactions on Dependable and Secure Computing, 1(4), 238–254. https://doi.org/10.1109/TDSC.2004.34</w:t>
@@ -2006,9 +1705,12 @@
       <w:r>
         <w:rPr>
           <w:rFonts w:ascii="Book Antiqua" w:hAnsi="Book Antiqua"/>
-          <w:b w:val="0"/>
-          <w:i w:val="0"/>
           <w:color w:val="000000"/>
+        </w:rPr>
+      </w:r>
+      <w:r>
+        <w:rPr>
+          <w:rFonts w:ascii="Book Antiqua" w:hAnsi="Book Antiqua"/>
           <w:sz w:val="22"/>
         </w:rPr>
         <w:t>Bertino, E., Catania, B., &amp; Damiani, M. L. (2005). GEO-RBAC: A spatially aware RBAC. In Proceedings of the 10th ACM Symposium on Access Control Models and Technologies (SACMAT '05) (pp. 29–37). Association for Computing Machinery. https://doi.org/10.1145/1063979.1063985</w:t>
@@ -2022,9 +1724,18 @@
       <w:r>
         <w:rPr>
           <w:rFonts w:ascii="Book Antiqua" w:hAnsi="Book Antiqua"/>
-          <w:b w:val="0"/>
-          <w:i w:val="0"/>
           <w:color w:val="000000"/>
+        </w:rPr>
+      </w:r>
+      <w:r>
+        <w:rPr>
+          <w:rFonts w:ascii="Book Antiqua" w:hAnsi="Book Antiqua"/>
+          <w:color w:val="000000"/>
+        </w:rPr>
+      </w:r>
+      <w:r>
+        <w:rPr>
+          <w:rFonts w:ascii="Book Antiqua" w:hAnsi="Book Antiqua"/>
           <w:sz w:val="22"/>
         </w:rPr>
         <w:t>Chun, S. A., &amp; Atluri, V. (2008). Geospatial database security. In H. Chen, T. S. Raghu, R. Ramesh, R. Sharman, &amp; S. Chakravarty (Eds.), Handbook of Database Security: Applications and Trends (pp. 251–277). Springer. https://doi.org/10.1007/978-0-387-48533-1_11</w:t>
@@ -2038,9 +1749,12 @@
       <w:r>
         <w:rPr>
           <w:rFonts w:ascii="Book Antiqua" w:hAnsi="Book Antiqua"/>
-          <w:b w:val="0"/>
-          <w:i w:val="0"/>
           <w:color w:val="000000"/>
+        </w:rPr>
+      </w:r>
+      <w:r>
+        <w:rPr>
+          <w:rFonts w:ascii="Book Antiqua" w:hAnsi="Book Antiqua"/>
           <w:sz w:val="22"/>
         </w:rPr>
         <w:t>Clarke, J. (2012). SQL Injection Attacks and Defense (2nd ed.). Syngress / Elsevier.</w:t>
@@ -2054,9 +1768,12 @@
       <w:r>
         <w:rPr>
           <w:rFonts w:ascii="Book Antiqua" w:hAnsi="Book Antiqua"/>
-          <w:b w:val="0"/>
-          <w:i w:val="0"/>
           <w:color w:val="000000"/>
+        </w:rPr>
+      </w:r>
+      <w:r>
+        <w:rPr>
+          <w:rFonts w:ascii="Book Antiqua" w:hAnsi="Book Antiqua"/>
           <w:sz w:val="22"/>
         </w:rPr>
         <w:t>Crosby, S. A., &amp; Wallach, D. S. (2003). Denial of service via algorithmic complexity attacks. In Proceedings of the 12th USENIX Security Symposium (pp. 29–44). USENIX Association.</w:t>
@@ -2070,9 +1787,12 @@
       <w:r>
         <w:rPr>
           <w:rFonts w:ascii="Book Antiqua" w:hAnsi="Book Antiqua"/>
-          <w:b w:val="0"/>
-          <w:i w:val="0"/>
           <w:color w:val="000000"/>
+        </w:rPr>
+      </w:r>
+      <w:r>
+        <w:rPr>
+          <w:rFonts w:ascii="Book Antiqua" w:hAnsi="Book Antiqua"/>
           <w:sz w:val="22"/>
         </w:rPr>
         <w:t>Egenhofer, M. J. (1994). Spatial SQL: A query and presentation language. IEEE Transactions on Knowledge and Data Engineering, 6(1), 86–95. https://doi.org/10.1109/69.273029</w:t>
@@ -2086,9 +1806,12 @@
       <w:r>
         <w:rPr>
           <w:rFonts w:ascii="Book Antiqua" w:hAnsi="Book Antiqua"/>
-          <w:b w:val="0"/>
-          <w:i w:val="0"/>
           <w:color w:val="000000"/>
+        </w:rPr>
+      </w:r>
+      <w:r>
+        <w:rPr>
+          <w:rFonts w:ascii="Book Antiqua" w:hAnsi="Book Antiqua"/>
           <w:sz w:val="22"/>
         </w:rPr>
         <w:t>Halfond, W. G., Viegas, J., &amp; Orso, A. (2006). A classification of SQL-injection attacks and countermeasures. In Proceedings of the IEEE International Symposium on Secure Software Engineering (ISSSE '06). IEEE.</w:t>
@@ -2102,9 +1825,12 @@
       <w:r>
         <w:rPr>
           <w:rFonts w:ascii="Book Antiqua" w:hAnsi="Book Antiqua"/>
-          <w:b w:val="0"/>
-          <w:i w:val="0"/>
           <w:color w:val="000000"/>
+        </w:rPr>
+      </w:r>
+      <w:r>
+        <w:rPr>
+          <w:rFonts w:ascii="Book Antiqua" w:hAnsi="Book Antiqua"/>
           <w:sz w:val="22"/>
         </w:rPr>
         <w:t>Kara, A., Çağdaş, V., Isikdag, U., van Oosterom, P., Lemmen, C., &amp; Stubkjær, E. (2021). Towards the LADM Valuation Information Model: A case study in Turkey. Land Use Policy, 109, 105658. https://doi.org/10.1016/j.landusepol.2021.105658</w:t>
@@ -2118,9 +1844,12 @@
       <w:r>
         <w:rPr>
           <w:rFonts w:ascii="Book Antiqua" w:hAnsi="Book Antiqua"/>
-          <w:b w:val="0"/>
-          <w:i w:val="0"/>
           <w:color w:val="000000"/>
+        </w:rPr>
+      </w:r>
+      <w:r>
+        <w:rPr>
+          <w:rFonts w:ascii="Book Antiqua" w:hAnsi="Book Antiqua"/>
           <w:sz w:val="22"/>
         </w:rPr>
         <w:t>Lemmen, C., van Oosterom, P., &amp; Bennett, R. (2015). The Land Administration Domain Model. Land Use Policy, 49, 535–545. https://doi.org/10.1016/j.landusepol.2015.01.014</w:t>
@@ -2134,9 +1863,12 @@
       <w:r>
         <w:rPr>
           <w:rFonts w:ascii="Book Antiqua" w:hAnsi="Book Antiqua"/>
-          <w:b w:val="0"/>
-          <w:i w:val="0"/>
           <w:color w:val="000000"/>
+        </w:rPr>
+      </w:r>
+      <w:r>
+        <w:rPr>
+          <w:rFonts w:ascii="Book Antiqua" w:hAnsi="Book Antiqua"/>
           <w:sz w:val="22"/>
         </w:rPr>
         <w:t>National Vulnerability Database. (2023). CVE-2023-25157 Detail: GeoServer SQL Injection Vulnerability. National Institute of Standards and Technology. https://nvd.nist.gov/vuln/detail/CVE-2023-25157</w:t>
@@ -2150,9 +1882,12 @@
       <w:r>
         <w:rPr>
           <w:rFonts w:ascii="Book Antiqua" w:hAnsi="Book Antiqua"/>
-          <w:b w:val="0"/>
-          <w:i w:val="0"/>
           <w:color w:val="000000"/>
+        </w:rPr>
+      </w:r>
+      <w:r>
+        <w:rPr>
+          <w:rFonts w:ascii="Book Antiqua" w:hAnsi="Book Antiqua"/>
           <w:sz w:val="22"/>
         </w:rPr>
         <w:t>Obe, R. O., &amp; Hsu, L. S. (2021). PostGIS in Action (3rd ed.). Manning Publications.</w:t>
@@ -2166,9 +1901,6 @@
       <w:r>
         <w:rPr>
           <w:rFonts w:ascii="Book Antiqua" w:hAnsi="Book Antiqua"/>
-          <w:b w:val="0"/>
-          <w:i w:val="0"/>
-          <w:color w:val="000000"/>
           <w:sz w:val="22"/>
         </w:rPr>
         <w:t>OWASP Foundation. (2021). OWASP Top 10:2021 - The Ten Most Critical Web Application Security Risks. Open Web Application Security Project. https://owasp.org/Top10/</w:t>
@@ -2182,9 +1914,6 @@
       <w:r>
         <w:rPr>
           <w:rFonts w:ascii="Book Antiqua" w:hAnsi="Book Antiqua"/>
-          <w:b w:val="0"/>
-          <w:i w:val="0"/>
-          <w:color w:val="000000"/>
           <w:sz w:val="22"/>
         </w:rPr>
         <w:t>OWASP Foundation. (2023). Web Security Testing Guide (WSTG v4.2). Open Web Application Security Project. https://owasp.org/www-project-web-security-testing-guide/</w:t>
@@ -2198,9 +1927,6 @@
       <w:r>
         <w:rPr>
           <w:rFonts w:ascii="Book Antiqua" w:hAnsi="Book Antiqua"/>
-          <w:b w:val="0"/>
-          <w:i w:val="0"/>
-          <w:color w:val="000000"/>
           <w:sz w:val="22"/>
         </w:rPr>
         <w:t>van Oosterom, P., Lemmen, C., &amp; Ingvarsson, T. (2006). The core cadastral domain model. Computers, Environment and Urban Systems, 30(5), 627–660. https://doi.org/10.1016/j.compenvurbsys.2005.12.002</w:t>
@@ -2210,13 +1936,12 @@
       <w:pPr>
         <w:spacing w:before="240" w:after="80"/>
       </w:pPr>
+      <w:r/>
       <w:r>
         <w:rPr>
           <w:rFonts w:ascii="Book Antiqua" w:hAnsi="Book Antiqua"/>
           <w:b/>
           <w:i w:val="0"/>
-          <w:color w:val="000000"/>
-          <w:sz w:val="22"/>
         </w:rPr>
         <w:t>This paper may be cited as:</w:t>
       </w:r>
@@ -2226,13 +1951,12 @@
         <w:spacing w:after="240"/>
         <w:ind w:left="720" w:hanging="720"/>
       </w:pPr>
+      <w:r/>
       <w:r>
         <w:rPr>
           <w:rFonts w:ascii="Book Antiqua" w:hAnsi="Book Antiqua"/>
           <w:b w:val="0"/>
           <w:i w:val="0"/>
-          <w:color w:val="000000"/>
-          <w:sz w:val="22"/>
         </w:rPr>
         <w:t>Rodrigo, A. (2026). Evaluation of Spatial SQL Injection Vulnerabilities in PostGIS-Based Cadastral Information Systems. International Multidisciplinary Journal of Emerging Technologies and Applications, 1(1), 1-8. https://imjeta.org/index.php/IMJETA/libraryFiles/downloadPublic/1</w:t>
       </w:r>
@@ -2247,12 +1971,12 @@
         <w:keepNext/>
         <w:spacing w:before="240" w:after="80"/>
       </w:pPr>
+      <w:r/>
       <w:r>
         <w:rPr>
           <w:rFonts w:ascii="Book Antiqua" w:hAnsi="Book Antiqua"/>
           <w:b/>
           <w:i w:val="0"/>
-          <w:color w:val="000000"/>
           <w:sz w:val="24"/>
         </w:rPr>
         <w:t>Appendix 1</w:t>
@@ -2262,45 +1986,42 @@
       <w:pPr>
         <w:spacing w:after="80" w:line="240" w:lineRule="auto"/>
       </w:pPr>
+      <w:r/>
       <w:r>
         <w:rPr>
           <w:rFonts w:ascii="Book Antiqua" w:hAnsi="Book Antiqua"/>
           <w:b w:val="0"/>
           <w:i w:val="0"/>
-          <w:color w:val="000000"/>
-          <w:sz w:val="22"/>
-        </w:rPr>
-        <w:t>Research Instrument: Experimental Battery of Spatial SQL Injection Vectors. The following table details the six exploitation vectors designed and executed to evaluate the security of the cadastral API:</w:t>
+        </w:rPr>
+        <w:t>Research Instrument: Experimental Battery of Spatial SQL Injection Vectors. Below are the six exploitation vectors designed and executed to evaluate the security of the cadastral API:</w:t>
       </w:r>
     </w:p>
     <w:tbl>
       <w:tblPr>
-        <w:tblW w:type="auto" w:w="0"/>
+        <w:tblW w:w="0" w:type="auto"/>
         <w:jc w:val="center"/>
-        <w:tblLook w:firstColumn="1" w:firstRow="1" w:lastColumn="0" w:lastRow="0" w:noHBand="0" w:noVBand="1" w:val="04A0"/>
+        <w:tblLook w:val="04A0" w:firstRow="1" w:lastRow="0" w:firstColumn="1" w:lastColumn="0" w:noHBand="0" w:noVBand="1"/>
       </w:tblPr>
       <w:tblGrid>
-        <w:gridCol w:w="2052"/>
-        <w:gridCol w:w="2052"/>
-        <w:gridCol w:w="2052"/>
-        <w:gridCol w:w="2052"/>
+        <w:gridCol w:w="1050"/>
+        <w:gridCol w:w="2951"/>
+        <w:gridCol w:w="2496"/>
+        <w:gridCol w:w="1711"/>
       </w:tblGrid>
       <w:tr>
-        <w:tc>
-          <w:tcPr>
-            <w:tcW w:type="dxa" w:w="2052"/>
-          </w:tcPr>
-          <w:p>
-            <w:pPr>
-              <w:spacing w:before="40" w:after="40"/>
-              <w:jc w:val="left"/>
-            </w:pPr>
+        <w:trPr>
+          <w:jc w:val="center"/>
+        </w:trPr>
+        <w:tc>
+          <w:tcPr>
+            <w:tcW w:w="2052" w:type="dxa"/>
+          </w:tcPr>
+          <w:p>
+            <w:r/>
             <w:r>
               <w:rPr>
                 <w:rFonts w:ascii="Book Antiqua" w:hAnsi="Book Antiqua"/>
                 <w:b/>
-                <w:i w:val="0"/>
-                <w:color w:val="000000"/>
                 <w:sz w:val="18"/>
               </w:rPr>
               <w:t>Test Vector</w:t>
@@ -2309,19 +2030,14 @@
         </w:tc>
         <w:tc>
           <w:tcPr>
-            <w:tcW w:type="dxa" w:w="2052"/>
-          </w:tcPr>
-          <w:p>
-            <w:pPr>
-              <w:spacing w:before="40" w:after="40"/>
-              <w:jc w:val="left"/>
-            </w:pPr>
+            <w:tcW w:w="2052" w:type="dxa"/>
+          </w:tcPr>
+          <w:p>
+            <w:r/>
             <w:r>
               <w:rPr>
                 <w:rFonts w:ascii="Book Antiqua" w:hAnsi="Book Antiqua"/>
                 <w:b/>
-                <w:i w:val="0"/>
-                <w:color w:val="000000"/>
                 <w:sz w:val="18"/>
               </w:rPr>
               <w:t>Evaluated Endpoint</w:t>
@@ -2330,19 +2046,14 @@
         </w:tc>
         <w:tc>
           <w:tcPr>
-            <w:tcW w:type="dxa" w:w="2052"/>
-          </w:tcPr>
-          <w:p>
-            <w:pPr>
-              <w:spacing w:before="40" w:after="40"/>
-              <w:jc w:val="left"/>
-            </w:pPr>
+            <w:tcW w:w="2052" w:type="dxa"/>
+          </w:tcPr>
+          <w:p>
+            <w:r/>
             <w:r>
               <w:rPr>
                 <w:rFonts w:ascii="Book Antiqua" w:hAnsi="Book Antiqua"/>
                 <w:b/>
-                <w:i w:val="0"/>
-                <w:color w:val="000000"/>
                 <w:sz w:val="18"/>
               </w:rPr>
               <w:t>Representative Payload</w:t>
@@ -2351,19 +2062,14 @@
         </w:tc>
         <w:tc>
           <w:tcPr>
-            <w:tcW w:type="dxa" w:w="2052"/>
-          </w:tcPr>
-          <w:p>
-            <w:pPr>
-              <w:spacing w:before="40" w:after="40"/>
-              <w:jc w:val="left"/>
-            </w:pPr>
+            <w:tcW w:w="2052" w:type="dxa"/>
+          </w:tcPr>
+          <w:p>
+            <w:r/>
             <w:r>
               <w:rPr>
                 <w:rFonts w:ascii="Book Antiqua" w:hAnsi="Book Antiqua"/>
                 <w:b/>
-                <w:i w:val="0"/>
-                <w:color w:val="000000"/>
                 <w:sz w:val="18"/>
               </w:rPr>
               <w:t>CIA Dimension and Effect</w:t>
@@ -2372,21 +2078,18 @@
         </w:tc>
       </w:tr>
       <w:tr>
-        <w:tc>
-          <w:tcPr>
-            <w:tcW w:type="dxa" w:w="2052"/>
-          </w:tcPr>
-          <w:p>
-            <w:pPr>
-              <w:spacing w:before="40" w:after="40"/>
-              <w:jc w:val="left"/>
-            </w:pPr>
-            <w:r>
-              <w:rPr>
-                <w:rFonts w:ascii="Book Antiqua" w:hAnsi="Book Antiqua"/>
-                <w:b w:val="0"/>
-                <w:i w:val="0"/>
-                <w:color w:val="000000"/>
+        <w:trPr>
+          <w:jc w:val="center"/>
+        </w:trPr>
+        <w:tc>
+          <w:tcPr>
+            <w:tcW w:w="2052" w:type="dxa"/>
+          </w:tcPr>
+          <w:p>
+            <w:r/>
+            <w:r>
+              <w:rPr>
+                <w:rFonts w:ascii="Book Antiqua" w:hAnsi="Book Antiqua"/>
                 <w:sz w:val="18"/>
               </w:rPr>
               <w:t>1. Logic Bypass</w:t>
@@ -2395,19 +2098,13 @@
         </w:tc>
         <w:tc>
           <w:tcPr>
-            <w:tcW w:type="dxa" w:w="2052"/>
-          </w:tcPr>
-          <w:p>
-            <w:pPr>
-              <w:spacing w:before="40" w:after="40"/>
-              <w:jc w:val="left"/>
-            </w:pPr>
-            <w:r>
-              <w:rPr>
-                <w:rFonts w:ascii="Book Antiqua" w:hAnsi="Book Antiqua"/>
-                <w:b w:val="0"/>
-                <w:i w:val="0"/>
-                <w:color w:val="000000"/>
+            <w:tcW w:w="2052" w:type="dxa"/>
+          </w:tcPr>
+          <w:p>
+            <w:r/>
+            <w:r>
+              <w:rPr>
+                <w:rFonts w:ascii="Book Antiqua" w:hAnsi="Book Antiqua"/>
                 <w:sz w:val="18"/>
               </w:rPr>
               <w:t>GET /api/v1/vulnerable/predios/radio</w:t>
@@ -2416,19 +2113,13 @@
         </w:tc>
         <w:tc>
           <w:tcPr>
-            <w:tcW w:type="dxa" w:w="2052"/>
-          </w:tcPr>
-          <w:p>
-            <w:pPr>
-              <w:spacing w:before="40" w:after="40"/>
-              <w:jc w:val="left"/>
-            </w:pPr>
-            <w:r>
-              <w:rPr>
-                <w:rFonts w:ascii="Book Antiqua" w:hAnsi="Book Antiqua"/>
-                <w:b w:val="0"/>
-                <w:i w:val="0"/>
-                <w:color w:val="000000"/>
+            <w:tcW w:w="2052" w:type="dxa"/>
+          </w:tcPr>
+          <w:p>
+            <w:r/>
+            <w:r>
+              <w:rPr>
+                <w:rFonts w:ascii="Book Antiqua" w:hAnsi="Book Antiqua"/>
                 <w:sz w:val="18"/>
               </w:rPr>
               <w:t>50) OR 1=1 --</w:t>
@@ -2437,19 +2128,13 @@
         </w:tc>
         <w:tc>
           <w:tcPr>
-            <w:tcW w:type="dxa" w:w="2052"/>
-          </w:tcPr>
-          <w:p>
-            <w:pPr>
-              <w:spacing w:before="40" w:after="40"/>
-              <w:jc w:val="left"/>
-            </w:pPr>
-            <w:r>
-              <w:rPr>
-                <w:rFonts w:ascii="Book Antiqua" w:hAnsi="Book Antiqua"/>
-                <w:b w:val="0"/>
-                <w:i w:val="0"/>
-                <w:color w:val="000000"/>
+            <w:tcW w:w="2052" w:type="dxa"/>
+          </w:tcPr>
+          <w:p>
+            <w:r/>
+            <w:r>
+              <w:rPr>
+                <w:rFonts w:ascii="Book Antiqua" w:hAnsi="Book Antiqua"/>
                 <w:sz w:val="18"/>
               </w:rPr>
               <w:t>Confidentiality: Exfiltration of parcels from restricted sectors.</w:t>
@@ -2458,42 +2143,33 @@
         </w:tc>
       </w:tr>
       <w:tr>
-        <w:tc>
-          <w:tcPr>
-            <w:tcW w:type="dxa" w:w="2052"/>
-          </w:tcPr>
-          <w:p>
-            <w:pPr>
-              <w:spacing w:before="40" w:after="40"/>
-              <w:jc w:val="left"/>
-            </w:pPr>
-            <w:r>
-              <w:rPr>
-                <w:rFonts w:ascii="Book Antiqua" w:hAnsi="Book Antiqua"/>
-                <w:b w:val="0"/>
-                <w:i w:val="0"/>
-                <w:color w:val="000000"/>
+        <w:trPr>
+          <w:jc w:val="center"/>
+        </w:trPr>
+        <w:tc>
+          <w:tcPr>
+            <w:tcW w:w="2052" w:type="dxa"/>
+          </w:tcPr>
+          <w:p>
+            <w:r/>
+            <w:r>
+              <w:rPr>
+                <w:rFonts w:ascii="Book Antiqua" w:hAnsi="Book Antiqua"/>
                 <w:sz w:val="18"/>
               </w:rPr>
-              <w:t>2. Blind Side-Channel</w:t>
-            </w:r>
-          </w:p>
-        </w:tc>
-        <w:tc>
-          <w:tcPr>
-            <w:tcW w:type="dxa" w:w="2052"/>
-          </w:tcPr>
-          <w:p>
-            <w:pPr>
-              <w:spacing w:before="40" w:after="40"/>
-              <w:jc w:val="left"/>
-            </w:pPr>
-            <w:r>
-              <w:rPr>
-                <w:rFonts w:ascii="Book Antiqua" w:hAnsi="Book Antiqua"/>
-                <w:b w:val="0"/>
-                <w:i w:val="0"/>
-                <w:color w:val="000000"/>
+              <w:t>2. Blind Side Channel</w:t>
+            </w:r>
+          </w:p>
+        </w:tc>
+        <w:tc>
+          <w:tcPr>
+            <w:tcW w:w="2052" w:type="dxa"/>
+          </w:tcPr>
+          <w:p>
+            <w:r/>
+            <w:r>
+              <w:rPr>
+                <w:rFonts w:ascii="Book Antiqua" w:hAnsi="Book Antiqua"/>
                 <w:sz w:val="18"/>
               </w:rPr>
               <w:t>GET /api/v1/vulnerable/predios/poligono</w:t>
@@ -2502,19 +2178,13 @@
         </w:tc>
         <w:tc>
           <w:tcPr>
-            <w:tcW w:type="dxa" w:w="2052"/>
-          </w:tcPr>
-          <w:p>
-            <w:pPr>
-              <w:spacing w:before="40" w:after="40"/>
-              <w:jc w:val="left"/>
-            </w:pPr>
-            <w:r>
-              <w:rPr>
-                <w:rFonts w:ascii="Book Antiqua" w:hAnsi="Book Antiqua"/>
-                <w:b w:val="0"/>
-                <w:i w:val="0"/>
-                <w:color w:val="000000"/>
+            <w:tcW w:w="2052" w:type="dxa"/>
+          </w:tcPr>
+          <w:p>
+            <w:r/>
+            <w:r>
+              <w:rPr>
+                <w:rFonts w:ascii="Book Antiqua" w:hAnsi="Book Antiqua"/>
                 <w:sz w:val="18"/>
               </w:rPr>
               <w:t>POLYGON(...) AND 1=(CASE WHEN ... THEN CAST(ST_GeomFromText('ERR') AS INT) ELSE 1 END)</w:t>
@@ -2523,42 +2193,33 @@
         </w:tc>
         <w:tc>
           <w:tcPr>
-            <w:tcW w:type="dxa" w:w="2052"/>
-          </w:tcPr>
-          <w:p>
-            <w:pPr>
-              <w:spacing w:before="40" w:after="40"/>
-              <w:jc w:val="left"/>
-            </w:pPr>
-            <w:r>
-              <w:rPr>
-                <w:rFonts w:ascii="Book Antiqua" w:hAnsi="Book Antiqua"/>
-                <w:b w:val="0"/>
-                <w:i w:val="0"/>
-                <w:color w:val="000000"/>
+            <w:tcW w:w="2052" w:type="dxa"/>
+          </w:tcPr>
+          <w:p>
+            <w:r/>
+            <w:r>
+              <w:rPr>
+                <w:rFonts w:ascii="Book Antiqua" w:hAnsi="Book Antiqua"/>
                 <w:sz w:val="18"/>
               </w:rPr>
-              <w:t>Confidentiality: Character-by-character extraction of credential hashes.</w:t>
+              <w:t>Confidentiality: Character-by-character exfiltration of hashes.</w:t>
             </w:r>
           </w:p>
         </w:tc>
       </w:tr>
       <w:tr>
-        <w:tc>
-          <w:tcPr>
-            <w:tcW w:type="dxa" w:w="2052"/>
-          </w:tcPr>
-          <w:p>
-            <w:pPr>
-              <w:spacing w:before="40" w:after="40"/>
-              <w:jc w:val="left"/>
-            </w:pPr>
-            <w:r>
-              <w:rPr>
-                <w:rFonts w:ascii="Book Antiqua" w:hAnsi="Book Antiqua"/>
-                <w:b w:val="0"/>
-                <w:i w:val="0"/>
-                <w:color w:val="000000"/>
+        <w:trPr>
+          <w:jc w:val="center"/>
+        </w:trPr>
+        <w:tc>
+          <w:tcPr>
+            <w:tcW w:w="2052" w:type="dxa"/>
+          </w:tcPr>
+          <w:p>
+            <w:r/>
+            <w:r>
+              <w:rPr>
+                <w:rFonts w:ascii="Book Antiqua" w:hAnsi="Book Antiqua"/>
                 <w:sz w:val="18"/>
               </w:rPr>
               <w:t>3. Algorithmic DoS</w:t>
@@ -2567,19 +2228,13 @@
         </w:tc>
         <w:tc>
           <w:tcPr>
-            <w:tcW w:type="dxa" w:w="2052"/>
-          </w:tcPr>
-          <w:p>
-            <w:pPr>
-              <w:spacing w:before="40" w:after="40"/>
-              <w:jc w:val="left"/>
-            </w:pPr>
-            <w:r>
-              <w:rPr>
-                <w:rFonts w:ascii="Book Antiqua" w:hAnsi="Book Antiqua"/>
-                <w:b w:val="0"/>
-                <w:i w:val="0"/>
-                <w:color w:val="000000"/>
+            <w:tcW w:w="2052" w:type="dxa"/>
+          </w:tcPr>
+          <w:p>
+            <w:r/>
+            <w:r>
+              <w:rPr>
+                <w:rFonts w:ascii="Book Antiqua" w:hAnsi="Book Antiqua"/>
                 <w:sz w:val="18"/>
               </w:rPr>
               <w:t>GET /api/v1/vulnerable/predios/analisis-expansion</w:t>
@@ -2588,19 +2243,13 @@
         </w:tc>
         <w:tc>
           <w:tcPr>
-            <w:tcW w:type="dxa" w:w="2052"/>
-          </w:tcPr>
-          <w:p>
-            <w:pPr>
-              <w:spacing w:before="40" w:after="40"/>
-              <w:jc w:val="left"/>
-            </w:pPr>
-            <w:r>
-              <w:rPr>
-                <w:rFonts w:ascii="Book Antiqua" w:hAnsi="Book Antiqua"/>
-                <w:b w:val="0"/>
-                <w:i w:val="0"/>
-                <w:color w:val="000000"/>
+            <w:tcW w:w="2052" w:type="dxa"/>
+          </w:tcPr>
+          <w:p>
+            <w:r/>
+            <w:r>
+              <w:rPr>
+                <w:rFonts w:ascii="Book Antiqua" w:hAnsi="Book Antiqua"/>
                 <w:sz w:val="18"/>
               </w:rPr>
               <w:t>10 + (SELECT COUNT(*) FROM tg_lote a CROSS JOIN ... ST_Buffer(..., 100))</w:t>
@@ -2609,63 +2258,48 @@
         </w:tc>
         <w:tc>
           <w:tcPr>
-            <w:tcW w:type="dxa" w:w="2052"/>
-          </w:tcPr>
-          <w:p>
-            <w:pPr>
-              <w:spacing w:before="40" w:after="40"/>
-              <w:jc w:val="left"/>
-            </w:pPr>
-            <w:r>
-              <w:rPr>
-                <w:rFonts w:ascii="Book Antiqua" w:hAnsi="Book Antiqua"/>
-                <w:b w:val="0"/>
-                <w:i w:val="0"/>
-                <w:color w:val="000000"/>
+            <w:tcW w:w="2052" w:type="dxa"/>
+          </w:tcPr>
+          <w:p>
+            <w:r/>
+            <w:r>
+              <w:rPr>
+                <w:rFonts w:ascii="Book Antiqua" w:hAnsi="Book Antiqua"/>
                 <w:sz w:val="18"/>
               </w:rPr>
-              <w:t>Availability: Combinatorial O(N^2) explosion, CPU core saturation.</w:t>
+              <w:t>Availability: Combinatorial O(N^2) explosion, CPU saturation.</w:t>
             </w:r>
           </w:p>
         </w:tc>
       </w:tr>
       <w:tr>
-        <w:tc>
-          <w:tcPr>
-            <w:tcW w:type="dxa" w:w="2052"/>
-          </w:tcPr>
-          <w:p>
-            <w:pPr>
-              <w:spacing w:before="40" w:after="40"/>
-              <w:jc w:val="left"/>
-            </w:pPr>
-            <w:r>
-              <w:rPr>
-                <w:rFonts w:ascii="Book Antiqua" w:hAnsi="Book Antiqua"/>
-                <w:b w:val="0"/>
-                <w:i w:val="0"/>
-                <w:color w:val="000000"/>
+        <w:trPr>
+          <w:jc w:val="center"/>
+        </w:trPr>
+        <w:tc>
+          <w:tcPr>
+            <w:tcW w:w="2052" w:type="dxa"/>
+          </w:tcPr>
+          <w:p>
+            <w:r/>
+            <w:r>
+              <w:rPr>
+                <w:rFonts w:ascii="Book Antiqua" w:hAnsi="Book Antiqua"/>
                 <w:sz w:val="18"/>
               </w:rPr>
-              <w:t>4. Cadastral Tampering</w:t>
-            </w:r>
-          </w:p>
-        </w:tc>
-        <w:tc>
-          <w:tcPr>
-            <w:tcW w:type="dxa" w:w="2052"/>
-          </w:tcPr>
-          <w:p>
-            <w:pPr>
-              <w:spacing w:before="40" w:after="40"/>
-              <w:jc w:val="left"/>
-            </w:pPr>
-            <w:r>
-              <w:rPr>
-                <w:rFonts w:ascii="Book Antiqua" w:hAnsi="Book Antiqua"/>
-                <w:b w:val="0"/>
-                <w:i w:val="0"/>
-                <w:color w:val="000000"/>
+              <w:t>4. Property Tampering</w:t>
+            </w:r>
+          </w:p>
+        </w:tc>
+        <w:tc>
+          <w:tcPr>
+            <w:tcW w:w="2052" w:type="dxa"/>
+          </w:tcPr>
+          <w:p>
+            <w:r/>
+            <w:r>
+              <w:rPr>
+                <w:rFonts w:ascii="Book Antiqua" w:hAnsi="Book Antiqua"/>
                 <w:sz w:val="18"/>
               </w:rPr>
               <w:t>POST /api/v1/vulnerable/ficha/modificar</w:t>
@@ -2674,19 +2308,13 @@
         </w:tc>
         <w:tc>
           <w:tcPr>
-            <w:tcW w:type="dxa" w:w="2052"/>
-          </w:tcPr>
-          <w:p>
-            <w:pPr>
-              <w:spacing w:before="40" w:after="40"/>
-              <w:jc w:val="left"/>
-            </w:pPr>
-            <w:r>
-              <w:rPr>
-                <w:rFonts w:ascii="Book Antiqua" w:hAnsi="Book Antiqua"/>
-                <w:b w:val="0"/>
-                <w:i w:val="0"/>
-                <w:color w:val="000000"/>
+            <w:tcW w:w="2052" w:type="dxa"/>
+          </w:tcPr>
+          <w:p>
+            <w:r/>
+            <w:r>
+              <w:rPr>
+                <w:rFonts w:ascii="Book Antiqua" w:hAnsi="Book Antiqua"/>
                 <w:sz w:val="18"/>
               </w:rPr>
               <w:t>id_lote = '21010101000000', nuevo_autovaluo = 0, nuevo_titular = 'HACKER'</w:t>
@@ -2695,42 +2323,33 @@
         </w:tc>
         <w:tc>
           <w:tcPr>
-            <w:tcW w:type="dxa" w:w="2052"/>
-          </w:tcPr>
-          <w:p>
-            <w:pPr>
-              <w:spacing w:before="40" w:after="40"/>
-              <w:jc w:val="left"/>
-            </w:pPr>
-            <w:r>
-              <w:rPr>
-                <w:rFonts w:ascii="Book Antiqua" w:hAnsi="Book Antiqua"/>
-                <w:b w:val="0"/>
-                <w:i w:val="0"/>
-                <w:color w:val="000000"/>
+            <w:tcW w:w="2052" w:type="dxa"/>
+          </w:tcPr>
+          <w:p>
+            <w:r/>
+            <w:r>
+              <w:rPr>
+                <w:rFonts w:ascii="Book Antiqua" w:hAnsi="Book Antiqua"/>
                 <w:sz w:val="18"/>
               </w:rPr>
-              <w:t>Integrity: Fiscal assessment alteration and ownership hijacking.</w:t>
+              <w:t>Integrity: Tax alteration and ownership spoofing.</w:t>
             </w:r>
           </w:p>
         </w:tc>
       </w:tr>
       <w:tr>
-        <w:tc>
-          <w:tcPr>
-            <w:tcW w:type="dxa" w:w="2052"/>
-          </w:tcPr>
-          <w:p>
-            <w:pPr>
-              <w:spacing w:before="40" w:after="40"/>
-              <w:jc w:val="left"/>
-            </w:pPr>
-            <w:r>
-              <w:rPr>
-                <w:rFonts w:ascii="Book Antiqua" w:hAnsi="Book Antiqua"/>
-                <w:b w:val="0"/>
-                <w:i w:val="0"/>
-                <w:color w:val="000000"/>
+        <w:trPr>
+          <w:jc w:val="center"/>
+        </w:trPr>
+        <w:tc>
+          <w:tcPr>
+            <w:tcW w:w="2052" w:type="dxa"/>
+          </w:tcPr>
+          <w:p>
+            <w:r/>
+            <w:r>
+              <w:rPr>
+                <w:rFonts w:ascii="Book Antiqua" w:hAnsi="Book Antiqua"/>
                 <w:sz w:val="18"/>
               </w:rPr>
               <w:t>5. Massive Deletion</w:t>
@@ -2739,19 +2358,13 @@
         </w:tc>
         <w:tc>
           <w:tcPr>
-            <w:tcW w:type="dxa" w:w="2052"/>
-          </w:tcPr>
-          <w:p>
-            <w:pPr>
-              <w:spacing w:before="40" w:after="40"/>
-              <w:jc w:val="left"/>
-            </w:pPr>
-            <w:r>
-              <w:rPr>
-                <w:rFonts w:ascii="Book Antiqua" w:hAnsi="Book Antiqua"/>
-                <w:b w:val="0"/>
-                <w:i w:val="0"/>
-                <w:color w:val="000000"/>
+            <w:tcW w:w="2052" w:type="dxa"/>
+          </w:tcPr>
+          <w:p>
+            <w:r/>
+            <w:r>
+              <w:rPr>
+                <w:rFonts w:ascii="Book Antiqua" w:hAnsi="Book Antiqua"/>
                 <w:sz w:val="18"/>
               </w:rPr>
               <w:t>DELETE /api/v1/vulnerable/predios/borrar</w:t>
@@ -2760,19 +2373,13 @@
         </w:tc>
         <w:tc>
           <w:tcPr>
-            <w:tcW w:type="dxa" w:w="2052"/>
-          </w:tcPr>
-          <w:p>
-            <w:pPr>
-              <w:spacing w:before="40" w:after="40"/>
-              <w:jc w:val="left"/>
-            </w:pPr>
-            <w:r>
-              <w:rPr>
-                <w:rFonts w:ascii="Book Antiqua" w:hAnsi="Book Antiqua"/>
-                <w:b w:val="0"/>
-                <w:i w:val="0"/>
-                <w:color w:val="000000"/>
+            <w:tcW w:w="2052" w:type="dxa"/>
+          </w:tcPr>
+          <w:p>
+            <w:r/>
+            <w:r>
+              <w:rPr>
+                <w:rFonts w:ascii="Book Antiqua" w:hAnsi="Book Antiqua"/>
                 <w:sz w:val="18"/>
               </w:rPr>
               <w:t>filtro_sector = '0101' OR '1'='1'</w:t>
@@ -2781,42 +2388,33 @@
         </w:tc>
         <w:tc>
           <w:tcPr>
-            <w:tcW w:type="dxa" w:w="2052"/>
-          </w:tcPr>
-          <w:p>
-            <w:pPr>
-              <w:spacing w:before="40" w:after="40"/>
-              <w:jc w:val="left"/>
-            </w:pPr>
-            <w:r>
-              <w:rPr>
-                <w:rFonts w:ascii="Book Antiqua" w:hAnsi="Book Antiqua"/>
-                <w:b w:val="0"/>
-                <w:i w:val="0"/>
-                <w:color w:val="000000"/>
+            <w:tcW w:w="2052" w:type="dxa"/>
+          </w:tcPr>
+          <w:p>
+            <w:r/>
+            <w:r>
+              <w:rPr>
+                <w:rFonts w:ascii="Book Antiqua" w:hAnsi="Book Antiqua"/>
                 <w:sz w:val="18"/>
               </w:rPr>
-              <w:t>Integrity &amp; Availability: Unconditional deletion of 1,500 cadastral parcels.</w:t>
+              <w:t>Integrity and Availability: Unconditional deletion of 1,500 parcels.</w:t>
             </w:r>
           </w:p>
         </w:tc>
       </w:tr>
       <w:tr>
-        <w:tc>
-          <w:tcPr>
-            <w:tcW w:type="dxa" w:w="2052"/>
-          </w:tcPr>
-          <w:p>
-            <w:pPr>
-              <w:spacing w:before="40" w:after="40"/>
-              <w:jc w:val="left"/>
-            </w:pPr>
-            <w:r>
-              <w:rPr>
-                <w:rFonts w:ascii="Book Antiqua" w:hAnsi="Book Antiqua"/>
-                <w:b w:val="0"/>
-                <w:i w:val="0"/>
-                <w:color w:val="000000"/>
+        <w:trPr>
+          <w:jc w:val="center"/>
+        </w:trPr>
+        <w:tc>
+          <w:tcPr>
+            <w:tcW w:w="2052" w:type="dxa"/>
+          </w:tcPr>
+          <w:p>
+            <w:r/>
+            <w:r>
+              <w:rPr>
+                <w:rFonts w:ascii="Book Antiqua" w:hAnsi="Book Antiqua"/>
                 <w:sz w:val="18"/>
               </w:rPr>
               <w:t>6. Auth Bypass</w:t>
@@ -2825,19 +2423,13 @@
         </w:tc>
         <w:tc>
           <w:tcPr>
-            <w:tcW w:type="dxa" w:w="2052"/>
-          </w:tcPr>
-          <w:p>
-            <w:pPr>
-              <w:spacing w:before="40" w:after="40"/>
-              <w:jc w:val="left"/>
-            </w:pPr>
-            <w:r>
-              <w:rPr>
-                <w:rFonts w:ascii="Book Antiqua" w:hAnsi="Book Antiqua"/>
-                <w:b w:val="0"/>
-                <w:i w:val="0"/>
-                <w:color w:val="000000"/>
+            <w:tcW w:w="2052" w:type="dxa"/>
+          </w:tcPr>
+          <w:p>
+            <w:r/>
+            <w:r>
+              <w:rPr>
+                <w:rFonts w:ascii="Book Antiqua" w:hAnsi="Book Antiqua"/>
                 <w:sz w:val="18"/>
               </w:rPr>
               <w:t>POST /api/v1/vulnerable/auth/login</w:t>
@@ -2846,19 +2438,13 @@
         </w:tc>
         <w:tc>
           <w:tcPr>
-            <w:tcW w:type="dxa" w:w="2052"/>
-          </w:tcPr>
-          <w:p>
-            <w:pPr>
-              <w:spacing w:before="40" w:after="40"/>
-              <w:jc w:val="left"/>
-            </w:pPr>
-            <w:r>
-              <w:rPr>
-                <w:rFonts w:ascii="Book Antiqua" w:hAnsi="Book Antiqua"/>
-                <w:b w:val="0"/>
-                <w:i w:val="0"/>
-                <w:color w:val="000000"/>
+            <w:tcW w:w="2052" w:type="dxa"/>
+          </w:tcPr>
+          <w:p>
+            <w:r/>
+            <w:r>
+              <w:rPr>
+                <w:rFonts w:ascii="Book Antiqua" w:hAnsi="Book Antiqua"/>
                 <w:sz w:val="18"/>
               </w:rPr>
               <w:t>username = admin' --</w:t>
@@ -2867,31 +2453,26 @@
         </w:tc>
         <w:tc>
           <w:tcPr>
-            <w:tcW w:type="dxa" w:w="2052"/>
-          </w:tcPr>
-          <w:p>
-            <w:pPr>
-              <w:spacing w:before="40" w:after="40"/>
-              <w:jc w:val="left"/>
-            </w:pPr>
-            <w:r>
-              <w:rPr>
-                <w:rFonts w:ascii="Book Antiqua" w:hAnsi="Book Antiqua"/>
-                <w:b w:val="0"/>
-                <w:i w:val="0"/>
-                <w:color w:val="000000"/>
+            <w:tcW w:w="2052" w:type="dxa"/>
+          </w:tcPr>
+          <w:p>
+            <w:r/>
+            <w:r>
+              <w:rPr>
+                <w:rFonts w:ascii="Book Antiqua" w:hAnsi="Book Antiqua"/>
                 <w:sz w:val="18"/>
               </w:rPr>
-              <w:t>Confidentiality &amp; Integrity: Privilege escalation to superadmin_catastro.</w:t>
+              <w:t>Confidentiality and Integrity: Escalation to superadmin_catastro.</w:t>
             </w:r>
           </w:p>
         </w:tc>
       </w:tr>
     </w:tbl>
+    <w:p/>
     <w:sectPr>
-      <w:headerReference w:type="default" r:id="rId14"/>
-      <w:footerReference w:type="default" r:id="rId15"/>
-      <w:headerReference w:type="first" r:id="rId16"/>
+      <w:headerReference w:type="default" r:id="rId12"/>
+      <w:footerReference w:type="default" r:id="rId13"/>
+      <w:headerReference w:type="first" r:id="rId14"/>
       <w:pgSz w:w="12240" w:h="15840" w:code="1"/>
       <w:pgMar w:top="1728" w:right="2016" w:bottom="1728" w:left="2016" w:header="720" w:footer="720" w:gutter="0"/>
       <w:pgNumType w:start="1"/>
@@ -4318,6 +3899,52 @@
       <w:shd w:val="clear" w:color="auto" w:fill="E1DFDD"/>
     </w:rPr>
   </w:style>
+  <w:style w:type="table" w:styleId="Tablanormal4">
+    <w:name w:val="Plain Table 4"/>
+    <w:basedOn w:val="Tablanormal"/>
+    <w:uiPriority w:val="44"/>
+    <w:rsid w:val="003D136C"/>
+    <w:tblPr>
+      <w:tblStyleRowBandSize w:val="1"/>
+      <w:tblStyleColBandSize w:val="1"/>
+    </w:tblPr>
+    <w:tblStylePr w:type="firstRow">
+      <w:rPr>
+        <w:b/>
+        <w:bCs/>
+      </w:rPr>
+    </w:tblStylePr>
+    <w:tblStylePr w:type="lastRow">
+      <w:rPr>
+        <w:b/>
+        <w:bCs/>
+      </w:rPr>
+    </w:tblStylePr>
+    <w:tblStylePr w:type="firstCol">
+      <w:rPr>
+        <w:b/>
+        <w:bCs/>
+      </w:rPr>
+    </w:tblStylePr>
+    <w:tblStylePr w:type="lastCol">
+      <w:rPr>
+        <w:b/>
+        <w:bCs/>
+      </w:rPr>
+    </w:tblStylePr>
+    <w:tblStylePr w:type="band1Vert">
+      <w:tblPr/>
+      <w:tcPr>
+        <w:shd w:val="clear" w:color="auto" w:fill="F2F2F2" w:themeFill="background1" w:themeFillShade="F2"/>
+      </w:tcPr>
+    </w:tblStylePr>
+    <w:tblStylePr w:type="band1Horz">
+      <w:tblPr/>
+      <w:tcPr>
+        <w:shd w:val="clear" w:color="auto" w:fill="F2F2F2" w:themeFill="background1" w:themeFillShade="F2"/>
+      </w:tcPr>
+    </w:tblStylePr>
+  </w:style>
 </w:styles>
 </file>
 

</xml_diff>

<commit_message>
docs(en): update sample size to 487 and add repository link in English paper
</commit_message>
<xml_diff>
--- a/Articulo_Cientifico_IMJETA_FINAL_EN.docx
+++ b/Articulo_Cientifico_IMJETA_FINAL_EN.docx
@@ -245,7 +245,7 @@
           <w:b w:val="0"/>
           <w:i w:val="0"/>
         </w:rPr>
-        <w:t>This article presents an experimental evaluation of spatial SQL injection vulnerabilities in PostGIS-based cadastral information systems. The study: (1) documents and evaluates six attack vectors oriented to the CIA triad (Confidentiality, Integrity, and Availability); (2) implements a reproducible testbed on a dataset of 1,500 urban parcels structured under the ISO 19152 (LADM) standard; and (3) quantifies the impact on latency and throughput of a mitigation architecture based on typed ORM compilation (GeoAlchemy2) and prior validation with Shapely and Pydantic.</w:t>
+        <w:t>This article presents an experimental evaluation of spatial SQL injection vulnerabilities in PostGIS-based cadastral information systems. The study: (1) documents and evaluates six attack vectors oriented to the CIA triad (Confidentiality, Integrity, and Availability); (2) implements a reproducible testbed on a dataset of 487 urban parcels structured under the ISO 19152 (LADM) standard; and (3) quantifies the impact on latency and throughput of a mitigation architecture based on typed ORM compilation (GeoAlchemy2) and prior validation with Shapely and Pydantic.</w:t>
       </w:r>
     </w:p>
     <w:p>
@@ -451,7 +451,7 @@
           <w:b w:val="0"/>
           <w:i w:val="0"/>
         </w:rPr>
-        <w:t>The experimental dataset comprises 1,500 contiguous urban cadastral parcels structured under the ISO 19152 standard (LADM, class LA_SpatialUnit) and georeferenced in EPSG:32719. To ensure reproducibility and ethical safeguarding, the base cartography was obtained from open sources and fiscal attributes were procedurally generated without including real personal information.</w:t>
+        <w:t>The experimental dataset comprises 487 contiguous urban cadastral parcels structured under the ISO 19152 standard (LADM, class LA_SpatialUnit) and georeferenced in EPSG:32719. To ensure reproducibility and ethical safeguarding, the base cartography was obtained from open sources and fiscal attributes were procedurally generated without including real personal information.</w:t>
       </w:r>
     </w:p>
     <w:p>
@@ -473,14 +473,8 @@
       <w:pPr>
         <w:spacing w:after="80" w:line="240" w:lineRule="auto"/>
       </w:pPr>
-      <w:r/>
-      <w:r>
-        <w:rPr>
-          <w:rFonts w:ascii="Book Antiqua" w:hAnsi="Book Antiqua"/>
-          <w:b w:val="0"/>
-          <w:i w:val="0"/>
-        </w:rPr>
-        <w:t>The testbed was implemented in Docker containers using isolated microservices: (1) a database service with PostgreSQL 15 and PostGIS 3.3, and (2) an API in Python 3.11 with FastAPI and Uvicorn. Stress tests were executed in a controlled environment with an Intel Core Ultra 5 245KF processor of 14 cores at 5.2 GHz with 32 GB DDR5 RAM and NVMe PCIe 4.0 storage on Linux kernel 6.6 (WSL2).</w:t>
+      <w:r>
+        <w:t>The testbed was implemented in Docker containers using isolated microservices: (1) a database service with PostgreSQL 15 and PostGIS 3.3, and (2) an API in Python 3.11 with FastAPI and Uvicorn. Stress tests were executed in a controlled environment with an Intel Core Ultra 5 245KF processor of 14 cores at 5.2 GHz with 32 GB DDR5 RAM and NVMe PCIe 4.0 storage on Linux kernel 6.6 (WSL2). Source code, dataset, and the interactive playground are publicly available at: https://github.com/RAlexander777/Playground-SQLi-PostGIS.</w:t>
       </w:r>
     </w:p>
     <w:p>
@@ -733,7 +727,7 @@
           <w:b w:val="0"/>
           <w:i w:val="0"/>
         </w:rPr>
-        <w:t>In the endpoint DELETE /api/v1/vulnerable/predios/borrar, injecting the literal payload '0101' OR '1'='1' into the sector filtering parameter transformed the statement into an unconditional deletion of records (DELETE FROM tg_lote WHERE cod_sector = '0101' OR '1'='1'), deleting all 1,500 parcels and leaving the webmapping viewer without cartography. In contrast, the mitigated endpoint validated the sector using the strict pattern ^\d{4}$, rejecting the injection with HTTP code 422 and preserving the cadastral database.</w:t>
+        <w:t>In the endpoint DELETE /api/v1/vulnerable/predios/borrar, injecting the literal payload '0101' OR '1'='1' into the sector filtering parameter transformed the statement into an unconditional deletion of records (DELETE FROM tg_lote WHERE cod_sector = '0101' OR '1'='1'), deleting all 487 parcels and leaving the webmapping viewer without cartography. In contrast, the mitigated endpoint validated the sector using the strict pattern ^\d{4}$, rejecting the injection with HTTP code 422 and preserving the cadastral database.</w:t>
       </w:r>
     </w:p>
     <w:p>
@@ -1640,7 +1634,7 @@
           <w:b w:val="0"/>
           <w:i w:val="0"/>
         </w:rPr>
-        <w:t>This article formalized and empirically demonstrated the viability of six spatial SQL injection vectors oriented to the CIA triad (Confidentiality, Integrity, and Availability) in PostGIS-based cadastral information systems, showing that native topological functions do not guarantee data isolation when constructed through string concatenation. The experimental evaluation on a dataset of 1,500 cadastral parcels structured under the ISO 19152 (LADM) standard verified that an attacker can bypass zonal boundaries, reconstruct credentials through geometric error side channels, induce denial of service through quadratic algorithmic overhead, alter property tax records, and execute bulk cartographic deletions. In response, the defense-in-depth architecture based on typed compilation through ORM (GeoAlchemy2), rigid typing with Pydantic, and prior topological validation in memory with Shapely successfully mitigated 100% of the evaluated exploitation scenarios. Transactional benchmarking demonstrated that this scheme introduces an average latency overhead of 2.63 ms (+15.24%), simultaneously improving stability at the 99th percentile by 12.59% thanks to the reuse of prepared execution plans in PostgreSQL. In conclusion, security in cadastral infrastructures requires abandoning the traditional scalar sanitization paradigm, adopting parameterization in the ORM and spatially aware syntactic controls integrated from the architectural software design.</w:t>
+        <w:t>This article formalized and empirically demonstrated the viability of six spatial SQL injection vectors oriented to the CIA triad (Confidentiality, Integrity, and Availability) in PostGIS-based cadastral information systems, showing that native topological functions do not guarantee data isolation when constructed through string concatenation. The experimental evaluation on a dataset of 487 cadastral parcels structured under the ISO 19152 (LADM) standard verified that an attacker can bypass zonal boundaries, reconstruct credentials through geometric error side channels, induce denial of service through quadratic algorithmic overhead, alter property tax records, and execute bulk cartographic deletions. In response, the defense-in-depth architecture based on typed compilation through ORM (GeoAlchemy2), rigid typing with Pydantic, and prior topological validation in memory with Shapely successfully mitigated 100% of the evaluated exploitation scenarios. Transactional benchmarking demonstrated that this scheme introduces an average latency overhead of 2.63 ms (+15.24%), simultaneously improving stability at the 99th percentile by 12.59% thanks to the reuse of prepared execution plans in PostgreSQL. In conclusion, security in cadastral infrastructures requires abandoning the traditional scalar sanitization paradigm, adopting parameterization in the ORM and spatially aware syntactic controls integrated from the architectural software design.</w:t>
       </w:r>
     </w:p>
     <w:p>
@@ -2391,13 +2385,8 @@
             <w:tcW w:w="2052" w:type="dxa"/>
           </w:tcPr>
           <w:p>
-            <w:r/>
-            <w:r>
-              <w:rPr>
-                <w:rFonts w:ascii="Book Antiqua" w:hAnsi="Book Antiqua"/>
-                <w:sz w:val="18"/>
-              </w:rPr>
-              <w:t>Integrity and Availability: Unconditional deletion of 1,500 parcels.</w:t>
+            <w:r>
+              <w:t>Integrity and Availability: Unconditional deletion of 487 parcels.</w:t>
             </w:r>
           </w:p>
         </w:tc>

</xml_diff>

<commit_message>
docs: align Spanish and English IMJETA papers 1:1 with 487-lot dataset and repo reference
</commit_message>
<xml_diff>
--- a/Articulo_Cientifico_IMJETA_FINAL_EN.docx
+++ b/Articulo_Cientifico_IMJETA_FINAL_EN.docx
@@ -143,24 +143,8 @@
         <w:spacing w:after="120" w:line="240" w:lineRule="auto"/>
         <w:ind w:left="720" w:right="720"/>
       </w:pPr>
-      <w:r/>
-      <w:r>
-        <w:rPr>
-          <w:rFonts w:ascii="Book Antiqua" w:hAnsi="Book Antiqua"/>
-          <w:b/>
-          <w:i w:val="0"/>
-          <w:sz w:val="20"/>
-        </w:rPr>
-        <w:t xml:space="preserve">Abstract. </w:t>
-      </w:r>
-      <w:r>
-        <w:rPr>
-          <w:rFonts w:ascii="Book Antiqua" w:hAnsi="Book Antiqua"/>
-          <w:b w:val="0"/>
-          <w:i w:val="0"/>
-          <w:sz w:val="20"/>
-        </w:rPr>
-        <w:t>The incorporation of spatial databases into web architectures has expanded the attack surface for modern applications; however, the risks associated with spatial SQL injections remain underexplored. This article investigates the exploitation and mitigation of spatial SQL injections within cadastral information systems that use PostGIS. A containerized testbed environment was developed, using Docker, to simulate an infrastructure API built with Python (FastAPI) and PostgreSQL/PostGIS. The study demonstrates how attackers can leverage spatial functions (ST_DWithin, ST_Intersects) to manipulate geospatial logic, extract unauthorized zoning data, or induce denial of service states. Furthermore, the research evaluates the impact on performance when implementing robust mitigation strategies, comparing vulnerable dynamic spatial queries with parameterized queries executed through Object-Relational Mapping (ORM) tools such as SQLAlchemy and GeoAlchemy2. The results indicate that the proposed pipeline neutralized 100% of the attack vectors with an average latency overhead of 2.63 ms (+15.24%) and a 12.59% improvement in tail stability (p99). It is concluded that effective mitigation of spatial injections relies on transferring topological validation and rigid parameterization to the application layer (ORM), ensuring cadastral integrity with marginal operational impact.</w:t>
+      <w:r>
+        <w:t>Abstract. The incorporation of spatial databases into web architectures has expanded the attack surface for modern applications; however, the risks associated with spatial SQL injections remain underexplored. This article investigates the exploitation and mitigation of spatial SQL injections within cadastral information systems that use PostGIS. A containerized testbed environment was developed, using Docker, to simulate an infrastructure API built with Python (FastAPI) and PostgreSQL/PostGIS. The study demonstrates how attackers can leverage spatial functions (ST_DWithin, ST_Intersects) to manipulate geospatial logic, extract unauthorized zoning data, or induce denial of service states. Furthermore, the research evaluates the impact on performance when implementing robust mitigation strategies, comparing vulnerable dynamic spatial queries with parameterized queries executed through Object-Relational Mapping (ORM) tools such as SQLAlchemy and GeoAlchemy2. The results indicate that the proposed pipeline neutralized 100% of the attack vectors with an average latency overhead of 2.63 ms (+15.24%) and a 12.59% improvement in tail stability (p99). It is concluded that effective mitigation of spatial injections does not depend on generic perimeter firewalls (WAF), but rather on transferring topological validation and rigid parameterization to the application layer (ORM), ensuring cadastral integrity with marginal operational impact.</w:t>
       </w:r>
     </w:p>
     <w:p>
@@ -496,14 +480,8 @@
       <w:pPr>
         <w:spacing w:after="80" w:line="240" w:lineRule="auto"/>
       </w:pPr>
-      <w:r/>
-      <w:r>
-        <w:rPr>
-          <w:rFonts w:ascii="Book Antiqua" w:hAnsi="Book Antiqua"/>
-          <w:b w:val="0"/>
-          <w:i w:val="0"/>
-        </w:rPr>
-        <w:t>Six exploitation vectors were structured based on the injection testing guidelines of the Web Security Testing Guide (OWASP Foundation, 2023), oriented to the three dimensions of the CIA triad (Confidentiality, Integrity, and Availability). The performance evaluation included a load of 300 requests and stepped concurrency curves (1 to 100 clients), recording latency metrics (mean, p50, p95, p99) and throughput (req/s).</w:t>
+      <w:r>
+        <w:t>Six exploitation vectors were structured based on the injection testing guidelines of the Web Security Testing Guide (OWASP Foundation, 2023), oriented to the three dimensions of the CIA triad (Confidentiality, Integrity, and Availability). The experimental battery comprised two categories of vectors: (a) direct spatial injection vectors (V1 to V3), targeted against native topological predicates and geometric analysis functions in PostGIS; and (b) conventional SQL injection vectors applied to the transactional and administrative workflow of the cadastre (V4 to V6), used as a baseline control to verify data model integrity and perimeter tool detection capabilities. Performance evaluation encompassed a load test of 300 requests and stepped concurrency curves (1 to 100 clients) on the territorial proximity endpoint (/predios/radio), recording latency metrics (mean, p50, p95, p99) and throughput (req/s). The technical characterization of the six exploitation vectors, their endpoints, and representative payloads are detailed in Appendix 1.</w:t>
       </w:r>
     </w:p>
     <w:p>
@@ -599,14 +577,8 @@
       <w:pPr>
         <w:spacing w:after="80" w:line="240" w:lineRule="auto"/>
       </w:pPr>
-      <w:r/>
-      <w:r>
-        <w:rPr>
-          <w:rFonts w:ascii="Book Antiqua" w:hAnsi="Book Antiqua"/>
-          <w:b w:val="0"/>
-          <w:i w:val="0"/>
-        </w:rPr>
-        <w:t>Leveraging the baseline geometric complexity of the parcels (average of 9.0 vertices and up to 222 vertices per polygon), the attacker injected a subquery with an O(N^2) spatial cross product into the endpoint GET /api/v1/vulnerable/predios/analisis-expansion that computes buffers with high segment density per quadrant. As evidenced in Figure 1, the injection of the Cartesian product triggers an O(N^2) algorithmic complexity explosion that raises latency from 10.8 ms up to 1,665.16 ms as evaluated buffer vertices grow from 14,400 to over 345,600 points, saturating PostgreSQL workers on the Intel Core Ultra 5 245KF processor. Conversely, the mitigated architecture preserves a bounded latency of ~15 ms by constraining parameters to validated scalars using Pydantic and GeoAlchemy2.</w:t>
+      <w:r>
+        <w:t>Leveraging the baseline geometric complexity of the parcels (average of 9.0 vertices and up to 222 vertices per polygon), the attacker injected a subquery with an O(N^2) spatial cross product into the endpoint GET /api/v1/vulnerable/predios/analisis-expansion that computes buffers with high segment density per quadrant. To isolate the computational cost of the Cartesian product without inducing a permanent crash of the test server, the injection evaluated a systematic subset of 20 parcels cross-joined against each other (400 polygon pairs), varying buffer vertex resolution. As evidenced in Figure 1, this Cartesian product injection triggers an O(N^2) algorithmic complexity explosion that raises latency from 10.8 ms up to 1,692.1 ms as evaluated buffer vertices grow from 14,400 to over 345,600 points, saturating PostgreSQL workers on the Intel Core Ultra 5 245KF processor. In contrast, the mitigated architecture preserves a bounded latency of ~15 ms by constraining parameters to validated scalars using Pydantic and GeoAlchemy2.</w:t>
       </w:r>
     </w:p>
     <w:p>
@@ -779,14 +751,8 @@
       <w:pPr>
         <w:spacing w:after="80" w:line="240" w:lineRule="auto"/>
       </w:pPr>
-      <w:r/>
-      <w:r>
-        <w:rPr>
-          <w:rFonts w:ascii="Book Antiqua" w:hAnsi="Book Antiqua"/>
-          <w:b w:val="0"/>
-          <w:i w:val="0"/>
-        </w:rPr>
-        <w:t>As illustrated in Figure 2, the architectural mitigation integrated a defense-in-depth pipeline with three sequential barriers: (1) Barrier 1 with Pydantic for strict typing and bounding of physical limits; (2) Barrier 2 with Shapely for topological validation and discarding degenerate geometries in application memory (returning HTTP 422 before interacting with the database); and (3) Barrier 3 with GeoAlchemy2 and SQLAlchemy for native compilation using binary bind variables (EWKB) and reuse of execution plans (prepared statements).</w:t>
+      <w:r>
+        <w:t>As illustrated in Figure 2, the architectural mitigation integrated a defense-in-depth pipeline with three sequential barriers, where Barrier 2 (Shapely) operates as an in-memory topological integrity filter activated specifically for complex geometric payloads (WKT or GeoJSON, discarding anomalies or self-intersecting geometries with HTTP 422 before interacting with the database), while purely numerical or alphanumeric parameters transit directly from strict Pydantic validation (Barrier 1) to compiled typed variables (EWKB) and prepared statements in GeoAlchemy2 and SQLAlchemy (Barrier 3).</w:t>
       </w:r>
     </w:p>
     <w:p>
@@ -857,14 +823,8 @@
         <w:spacing w:after="80" w:line="240" w:lineRule="auto"/>
         <w:ind w:firstLine="432"/>
       </w:pPr>
-      <w:r/>
-      <w:r>
-        <w:rPr>
-          <w:rFonts w:ascii="Book Antiqua" w:hAnsi="Book Antiqua"/>
-          <w:b w:val="0"/>
-          <w:i w:val="0"/>
-        </w:rPr>
-        <w:t>A comparative load test of 300 requests with 10 concurrent clients was executed between the vulnerable API and the mitigated API. The results are summarized in Table 1.</w:t>
+      <w:r>
+        <w:t>For the empirical performance and latency evaluation (Table 1 and Figure 3), the spatial query by radius endpoint (GET /api/v1/vulnerable/predios/radio vs. GET /api/v1/mitigated/predios/radio) was selected as a representative high-frequency transactional scenario, evaluating valid requests under a standardized load of 300 requests with 10 concurrent clients. The results are summarized in Table 1.</w:t>
       </w:r>
     </w:p>
     <w:p>
@@ -1379,14 +1339,8 @@
         <w:spacing w:after="80" w:line="240" w:lineRule="auto"/>
         <w:ind w:firstLine="432"/>
       </w:pPr>
-      <w:r/>
-      <w:r>
-        <w:rPr>
-          <w:rFonts w:ascii="Book Antiqua" w:hAnsi="Book Antiqua"/>
-          <w:b w:val="0"/>
-          <w:i w:val="0"/>
-        </w:rPr>
-        <w:t>To measure resilience under progressive stress, a stepped concurrency series of 1 to 100 clients was evaluated. As evidenced in Figure 3(a), the throughput of the mitigated architecture scales efficiently, reaching a stable plateau exceeding 450 req/s without degradation due to locks. Likewise, Figure 3(b) demonstrates that latency at the 99th percentile (p99) of the mitigated architecture remains systematically controlled and lower than that of the vulnerable version thanks to the reuse of execution plans in PostgreSQL.</w:t>
+      <w:r>
+        <w:t>To measure resilience under progressive stress, a stepped concurrency series of 1 to 100 concurrent clients was evaluated. As evidenced in Figure 3(a), the throughput of the mitigated architecture scales efficiently, reaching a stable plateau exceeding 450 req/s without lock degradation. Likewise, Figure 3(b) reveals that the mitigated architecture neutralizes the severe tail latency spikes observed in the vulnerable API under low concurrency (140.8 ms vs. 33.1 ms at 5 clients). Under high stress levels (50 to 100 clients), the 99th percentile of the mitigated version experiences a moderate increase (~101 ms vs. ~62 ms), attributable to serialization and CPU overhead in the application layer (Pydantic/ORM), representing an acceptable trade-off for the security guarantees obtained.</w:t>
       </w:r>
     </w:p>
     <w:p>
@@ -1487,14 +1441,8 @@
         <w:spacing w:after="80" w:line="240" w:lineRule="auto"/>
         <w:ind w:firstLine="432"/>
       </w:pPr>
-      <w:r/>
-      <w:r>
-        <w:rPr>
-          <w:rFonts w:ascii="Book Antiqua" w:hAnsi="Book Antiqua"/>
-          <w:b w:val="0"/>
-          <w:i w:val="0"/>
-        </w:rPr>
-        <w:t>This average overhead is acceptable given the protection guarantees obtained: it neutralizes massive parcel leakage, error-based side channels, and denial of service. As illustrated in Figure 4, traditional web application firewalls (signature-based WAFs such as OWASP CRS) lack geospatial grammar and block only between 0% and 20% of topological injections (ST_DWithin and ST_Intersects). In contrast, the three-barrier pipeline implemented at the application layer achieved a 100% mitigation rate across all evaluated vectors of the CIA triad.</w:t>
+      <w:r>
+        <w:t>This average overhead is acceptable given the protection guarantees obtained: it neutralizes massive parcel leakage, error-based side channels, and denial of service. As illustrated in Figure 4, traditional web application firewalls (signature-based WAFs such as OWASP CRS) lack geospatial grammar and block only between 0% and 20% of topological injections (ST_DWithin and ST_Intersects). The residual blocking of 15% to 20% recorded by the WAF in V1 and V2 was exclusively due to the detection of conventional SQL tokens (such as boolean OR operators or unmatched quotes) in certain payload variants, and not to semantic inspection of the underlying topological functions, as evidenced by its absolute failure (0%) against the DoS vector in V3. In contrast, the three-barrier pipeline implemented at the application layer achieved a 100% mitigation rate across all evaluated vectors of the CIA triad.</w:t>
       </w:r>
     </w:p>
     <w:p>
@@ -1980,14 +1928,8 @@
       <w:pPr>
         <w:spacing w:after="80" w:line="240" w:lineRule="auto"/>
       </w:pPr>
-      <w:r/>
-      <w:r>
-        <w:rPr>
-          <w:rFonts w:ascii="Book Antiqua" w:hAnsi="Book Antiqua"/>
-          <w:b w:val="0"/>
-          <w:i w:val="0"/>
-        </w:rPr>
-        <w:t>Research Instrument: Experimental Battery of Spatial SQL Injection Vectors. Below are the six exploitation vectors designed and executed to evaluate the security of the cadastral API:</w:t>
+      <w:r>
+        <w:t>Research Instrument: Exploitation Vector Battery: Spatial Operators (V1–V3) and Cadastral / Control Flow (V4–V6). Below are the six exploitation vectors designed and executed to evaluate the security of the cadastral API:</w:t>
       </w:r>
     </w:p>
     <w:tbl>

</xml_diff>

<commit_message>
docs: update paper, presentation materials, support sheets, and citation
</commit_message>
<xml_diff>
--- a/Articulo_Cientifico_IMJETA_FINAL_EN.docx
+++ b/Articulo_Cientifico_IMJETA_FINAL_EN.docx
@@ -144,7 +144,7 @@
         <w:ind w:left="720" w:right="720"/>
       </w:pPr>
       <w:r>
-        <w:t>Abstract. The incorporation of spatial databases into web architectures has expanded the attack surface for modern applications; however, the risks associated with spatial SQL injections remain underexplored. This article investigates the exploitation and mitigation of spatial SQL injections within cadastral information systems that use PostGIS. A containerized testbed environment was developed, using Docker, to simulate an infrastructure API built with Python (FastAPI) and PostgreSQL/PostGIS. The study demonstrates how attackers can leverage spatial functions (ST_DWithin, ST_Intersects) to manipulate geospatial logic, extract unauthorized zoning data, or induce denial of service states. Furthermore, the research evaluates the impact on performance when implementing robust mitigation strategies, comparing vulnerable dynamic spatial queries with parameterized queries executed through Object-Relational Mapping (ORM) tools such as SQLAlchemy and GeoAlchemy2. The results indicate that the proposed pipeline neutralized 100% of the attack vectors with an average latency overhead of 2.63 ms (+15.24%) and a 12.59% improvement in tail stability (p99). It is concluded that effective mitigation of spatial injections does not depend on generic perimeter firewalls (WAF), but rather on transferring topological validation and rigid parameterization to the application layer (ORM), ensuring cadastral integrity with marginal operational impact.</w:t>
+        <w:t>Abstract. The incorporation of spatial databases into web architectures has expanded the attack surface for modern applications; however, the risks associated with spatial SQL injections remain underexplored. This article investigates the exploitation and mitigation of spatial SQL injections within cadastral information systems that use PostGIS. A containerized testbed environment was developed, using Docker, to simulate an infrastructure API built with Python (FastAPI) and PostgreSQL/PostGIS. The study demonstrates how attackers can leverage spatial functions (ST_DWithin, ST_Intersects) to manipulate geospatial logic, extract unauthorized zoning data, or induce denial of service states. Furthermore, the research evaluates the impact on performance when implementing robust mitigation strategies, comparing vulnerable dynamic spatial queries with parameterized queries executed through Object-Relational Mapping (ORM) tools such as SQLAlchemy and GeoAlchemy2. The results indicate that the proposed pipeline neutralized 100% of the attack vectors with an average latency overhead of 2.63 ms (+15.24%) and a 12.59% improvement in tail stability (p99). It is concluded that effective mitigation of spatial injections relies on transferring topological validation and rigid parameterization to the application layer (ORM), ensuring cadastral integrity with marginal operational impact.</w:t>
       </w:r>
     </w:p>
     <w:p>
@@ -1442,70 +1442,7 @@
         <w:ind w:firstLine="432"/>
       </w:pPr>
       <w:r>
-        <w:t>This average overhead is acceptable given the protection guarantees obtained: it neutralizes massive parcel leakage, error-based side channels, and denial of service. As illustrated in Figure 4, traditional web application firewalls (signature-based WAFs such as OWASP CRS) lack geospatial grammar and block only between 0% and 20% of topological injections (ST_DWithin and ST_Intersects). The residual blocking of 15% to 20% recorded by the WAF in V1 and V2 was exclusively due to the detection of conventional SQL tokens (such as boolean OR operators or unmatched quotes) in certain payload variants, and not to semantic inspection of the underlying topological functions, as evidenced by its absolute failure (0%) against the DoS vector in V3. In contrast, the three-barrier pipeline implemented at the application layer achieved a 100% mitigation rate across all evaluated vectors of the CIA triad.</w:t>
-      </w:r>
-    </w:p>
-    <w:p>
-      <w:pPr>
-        <w:keepNext/>
-        <w:spacing w:before="160" w:after="40"/>
-        <w:jc w:val="center"/>
-      </w:pPr>
-      <w:r>
-        <w:rPr>
-          <w:noProof/>
-        </w:rPr>
-        <w:drawing>
-          <wp:inline distT="0" distB="0" distL="0" distR="0" wp14:anchorId="545B94D5" wp14:editId="5869901C">
-            <wp:extent cx="5303520" cy="2209800"/>
-            <wp:effectExtent l="0" t="0" r="0" b="0"/>
-            <wp:docPr id="4" name="Picture 4"/>
-            <wp:cNvGraphicFramePr>
-              <a:graphicFrameLocks xmlns:a="http://schemas.openxmlformats.org/drawingml/2006/main" noChangeAspect="1"/>
-            </wp:cNvGraphicFramePr>
-            <a:graphic xmlns:a="http://schemas.openxmlformats.org/drawingml/2006/main">
-              <a:graphicData uri="http://schemas.openxmlformats.org/drawingml/2006/picture">
-                <pic:pic xmlns:pic="http://schemas.openxmlformats.org/drawingml/2006/picture">
-                  <pic:nvPicPr>
-                    <pic:cNvPr id="0" name="fig4_attack_mitigation_matrix.png"/>
-                    <pic:cNvPicPr/>
-                  </pic:nvPicPr>
-                  <pic:blipFill>
-                    <a:blip r:embed="rId11"/>
-                    <a:stretch>
-                      <a:fillRect/>
-                    </a:stretch>
-                  </pic:blipFill>
-                  <pic:spPr>
-                    <a:xfrm>
-                      <a:off x="0" y="0"/>
-                      <a:ext cx="5303520" cy="2209800"/>
-                    </a:xfrm>
-                    <a:prstGeom prst="rect">
-                      <a:avLst/>
-                    </a:prstGeom>
-                  </pic:spPr>
-                </pic:pic>
-              </a:graphicData>
-            </a:graphic>
-          </wp:inline>
-        </w:drawing>
-      </w:r>
-    </w:p>
-    <w:p>
-      <w:pPr>
-        <w:spacing w:before="120" w:after="160"/>
-        <w:jc w:val="center"/>
-      </w:pPr>
-      <w:r/>
-      <w:r>
-        <w:rPr>
-          <w:rFonts w:ascii="Book Antiqua" w:hAnsi="Book Antiqua"/>
-          <w:b/>
-          <w:i w:val="0"/>
-          <w:sz w:val="20"/>
-        </w:rPr>
-        <w:t>Figure 4. Attack mitigation and blocking rate (%) across unprotected architecture, traditional WAF (OWASP CRS), and proposed pipeline</w:t>
+        <w:t>This average overhead is acceptable given the protection guarantees obtained: it neutralizes massive parcel leakage, error-based side channels, and denial of service. In contrast to the unprotected vulnerable architecture (where 100% of the attacks succeed), the three-barrier pipeline implemented at the application layer achieved a 100% mitigation rate across all evaluated vectors of the CIA triad.</w:t>
       </w:r>
     </w:p>
     <w:p>

</xml_diff>